<commit_message>
feat: implement pre-registration portal with multi-step enrollment form, status checking, and supporting backend API routes and models.
</commit_message>
<xml_diff>
--- a/Project_Documentation.docx
+++ b/Project_Documentation.docx
@@ -3,74 +3,150 @@
 <w:document xmlns:wpc="http://schemas.microsoft.com/office/word/2010/wordprocessingCanvas" xmlns:mo="http://schemas.microsoft.com/office/mac/office/2008/main" xmlns:mc="http://schemas.openxmlformats.org/markup-compatibility/2006" xmlns:mv="urn:schemas-microsoft-com:mac:vml" xmlns:o="urn:schemas-microsoft-com:office:office" xmlns:r="http://schemas.openxmlformats.org/officeDocument/2006/relationships" xmlns:m="http://schemas.openxmlformats.org/officeDocument/2006/math" xmlns:v="urn:schemas-microsoft-com:vml" xmlns:wp14="http://schemas.microsoft.com/office/word/2010/wordprocessingDrawing" xmlns:wp="http://schemas.openxmlformats.org/drawingml/2006/wordprocessingDrawing" xmlns:w10="urn:schemas-microsoft-com:office:word" xmlns:w="http://schemas.openxmlformats.org/wordprocessingml/2006/main" xmlns:w14="http://schemas.microsoft.com/office/word/2010/wordml" xmlns:wpg="http://schemas.microsoft.com/office/word/2010/wordprocessingGroup" xmlns:wpi="http://schemas.microsoft.com/office/word/2010/wordprocessingInk" xmlns:wne="http://schemas.microsoft.com/office/word/2006/wordml" xmlns:wps="http://schemas.microsoft.com/office/word/2010/wordprocessingShape" mc:Ignorable="w14 wp14">
   <w:body>
     <w:p>
-      <w:pPr>
-        <w:pStyle w:val="Title"/>
-        <w:jc w:val="center"/>
-      </w:pPr>
       <w:r>
-        <w:t>Project Documentation</w:t>
+        <w:rPr>
+          <w:rFonts w:ascii="Calibri" w:hAnsi="Calibri"/>
+          <w:b/>
+          <w:color w:val="1F4E78"/>
+          <w:sz w:val="44"/>
+        </w:rPr>
+        <w:t>Project Documentation: Calvary Christian Academy</w:t>
       </w:r>
     </w:p>
+    <w:p>
+      <w:r>
+        <w:rPr>
+          <w:b/>
+          <w:sz w:val="22"/>
+        </w:rPr>
+        <w:t xml:space="preserve">Proposed System: </w:t>
+      </w:r>
+      <w:r>
+        <w:rPr>
+          <w:sz w:val="22"/>
+        </w:rPr>
+        <w:t>Web-Based AI-Assisted Student Information and Academic Monitoring System</w:t>
+      </w:r>
+    </w:p>
+    <w:p/>
     <w:p>
       <w:pPr>
         <w:pStyle w:val="Heading1"/>
       </w:pPr>
       <w:r>
-        <w:t>Proposed System:</w:t>
+        <w:rPr>
+          <w:color w:val="1F4E78"/>
+        </w:rPr>
+        <w:t>1. Technology Stack</w:t>
+      </w:r>
+    </w:p>
+    <w:p>
+      <w:r>
+        <w:rPr>
+          <w:rFonts w:ascii="Calibri" w:hAnsi="Calibri"/>
+        </w:rPr>
+        <w:t>The system utilizes a modern decoupled architecture with a focus on AI integration and responsive design.</w:t>
       </w:r>
     </w:p>
     <w:p>
       <w:pPr>
-        <w:pStyle w:val="Subtitle"/>
+        <w:pStyle w:val="Heading2"/>
       </w:pPr>
       <w:r>
-        <w:t>Web-Based AI-Assisted Student Information and Academic Monitoring System for Calvary Christian Academy</w:t>
-      </w:r>
-    </w:p>
-    <w:p>
-      <w:pPr>
-        <w:pStyle w:val="Heading1"/>
-      </w:pPr>
-      <w:r>
-        <w:t>1. Techstack</w:t>
-      </w:r>
-    </w:p>
-    <w:p>
-      <w:pPr>
-        <w:pStyle w:val="BodyText"/>
-      </w:pPr>
-      <w:r>
-        <w:t>The system utilizes a modern full-stack architecture with a focus on AI integration and responsive design.</w:t>
+        <w:rPr>
+          <w:color w:val="2E75B6"/>
+        </w:rPr>
+        <w:t>Frontend Framework &amp; Styling</w:t>
       </w:r>
     </w:p>
     <w:tbl>
       <w:tblPr>
-        <w:tblStyle w:val="TableGrid"/>
         <w:tblW w:type="auto" w:w="0"/>
+        <w:jc w:val="center"/>
+        <w:tblLayout w:type="fixed"/>
         <w:tblLook w:firstColumn="1" w:firstRow="1" w:lastColumn="0" w:lastRow="0" w:noHBand="0" w:noVBand="1" w:val="04A0"/>
       </w:tblPr>
       <w:tblGrid>
-        <w:gridCol w:w="4320"/>
-        <w:gridCol w:w="4320"/>
+        <w:gridCol w:w="3120"/>
+        <w:gridCol w:w="3120"/>
+        <w:gridCol w:w="3120"/>
       </w:tblGrid>
       <w:tr>
         <w:tc>
           <w:tcPr>
-            <w:tcW w:type="dxa" w:w="4320"/>
+            <w:tcW w:type="dxa" w:w="2880"/>
+            <w:shd w:fill="1F4E78"/>
+            <w:tcMar>
+              <w:top w:w="120" w:type="dxa"/>
+              <w:bottom w:w="120" w:type="dxa"/>
+              <w:left w:w="150" w:type="dxa"/>
+              <w:right w:w="150" w:type="dxa"/>
+            </w:tcMar>
           </w:tcPr>
           <w:p>
+            <w:pPr>
+              <w:jc w:val="left"/>
+            </w:pPr>
             <w:r>
+              <w:rPr>
+                <w:rFonts w:ascii="Calibri" w:hAnsi="Calibri"/>
+                <w:b/>
+                <w:color w:val="FFFFFF"/>
+                <w:sz w:val="21"/>
+              </w:rPr>
               <w:t>Component</w:t>
             </w:r>
           </w:p>
         </w:tc>
         <w:tc>
           <w:tcPr>
-            <w:tcW w:type="dxa" w:w="4320"/>
+            <w:tcW w:type="dxa" w:w="2880"/>
+            <w:shd w:fill="1F4E78"/>
+            <w:tcMar>
+              <w:top w:w="120" w:type="dxa"/>
+              <w:bottom w:w="120" w:type="dxa"/>
+              <w:left w:w="150" w:type="dxa"/>
+              <w:right w:w="150" w:type="dxa"/>
+            </w:tcMar>
           </w:tcPr>
           <w:p>
+            <w:pPr>
+              <w:jc w:val="left"/>
+            </w:pPr>
             <w:r>
+              <w:rPr>
+                <w:rFonts w:ascii="Calibri" w:hAnsi="Calibri"/>
+                <w:b/>
+                <w:color w:val="FFFFFF"/>
+                <w:sz w:val="21"/>
+              </w:rPr>
               <w:t>Technology</w:t>
+            </w:r>
+          </w:p>
+        </w:tc>
+        <w:tc>
+          <w:tcPr>
+            <w:tcW w:type="dxa" w:w="3600"/>
+            <w:shd w:fill="1F4E78"/>
+            <w:tcMar>
+              <w:top w:w="120" w:type="dxa"/>
+              <w:bottom w:w="120" w:type="dxa"/>
+              <w:left w:w="150" w:type="dxa"/>
+              <w:right w:w="150" w:type="dxa"/>
+            </w:tcMar>
+          </w:tcPr>
+          <w:p>
+            <w:pPr>
+              <w:jc w:val="left"/>
+            </w:pPr>
+            <w:r>
+              <w:rPr>
+                <w:rFonts w:ascii="Calibri" w:hAnsi="Calibri"/>
+                <w:b/>
+                <w:color w:val="FFFFFF"/>
+                <w:sz w:val="21"/>
+              </w:rPr>
+              <w:t>Version / Detail</w:t>
             </w:r>
           </w:p>
         </w:tc>
@@ -78,21 +154,76 @@
       <w:tr>
         <w:tc>
           <w:tcPr>
-            <w:tcW w:type="dxa" w:w="4320"/>
+            <w:tcW w:type="dxa" w:w="2880"/>
+            <w:shd w:fill="FFFFFF"/>
+            <w:tcMar>
+              <w:top w:w="100" w:type="dxa"/>
+              <w:bottom w:w="100" w:type="dxa"/>
+              <w:left w:w="150" w:type="dxa"/>
+              <w:right w:w="150" w:type="dxa"/>
+            </w:tcMar>
           </w:tcPr>
           <w:p>
+            <w:pPr>
+              <w:jc w:val="left"/>
+            </w:pPr>
             <w:r>
+              <w:rPr>
+                <w:rFonts w:ascii="Calibri" w:hAnsi="Calibri"/>
+                <w:color w:val="323232"/>
+                <w:sz w:val="20"/>
+              </w:rPr>
               <w:t>Frontend Framework</w:t>
             </w:r>
           </w:p>
         </w:tc>
         <w:tc>
           <w:tcPr>
-            <w:tcW w:type="dxa" w:w="4320"/>
+            <w:tcW w:type="dxa" w:w="2880"/>
+            <w:shd w:fill="FFFFFF"/>
+            <w:tcMar>
+              <w:top w:w="100" w:type="dxa"/>
+              <w:bottom w:w="100" w:type="dxa"/>
+              <w:left w:w="150" w:type="dxa"/>
+              <w:right w:w="150" w:type="dxa"/>
+            </w:tcMar>
           </w:tcPr>
           <w:p>
+            <w:pPr>
+              <w:jc w:val="left"/>
+            </w:pPr>
             <w:r>
-              <w:t>React 19 (Vite)</w:t>
+              <w:rPr>
+                <w:rFonts w:ascii="Calibri" w:hAnsi="Calibri"/>
+                <w:color w:val="323232"/>
+                <w:sz w:val="20"/>
+              </w:rPr>
+              <w:t>React</w:t>
+            </w:r>
+          </w:p>
+        </w:tc>
+        <w:tc>
+          <w:tcPr>
+            <w:tcW w:type="dxa" w:w="3600"/>
+            <w:shd w:fill="FFFFFF"/>
+            <w:tcMar>
+              <w:top w:w="100" w:type="dxa"/>
+              <w:bottom w:w="100" w:type="dxa"/>
+              <w:left w:w="150" w:type="dxa"/>
+              <w:right w:w="150" w:type="dxa"/>
+            </w:tcMar>
+          </w:tcPr>
+          <w:p>
+            <w:pPr>
+              <w:jc w:val="left"/>
+            </w:pPr>
+            <w:r>
+              <w:rPr>
+                <w:rFonts w:ascii="Calibri" w:hAnsi="Calibri"/>
+                <w:color w:val="323232"/>
+                <w:sz w:val="20"/>
+              </w:rPr>
+              <w:t>^19.2.4 (Vite ^8.0.1)</w:t>
             </w:r>
           </w:p>
         </w:tc>
@@ -100,21 +231,76 @@
       <w:tr>
         <w:tc>
           <w:tcPr>
-            <w:tcW w:type="dxa" w:w="4320"/>
+            <w:tcW w:type="dxa" w:w="2880"/>
+            <w:shd w:fill="F2F4F7"/>
+            <w:tcMar>
+              <w:top w:w="100" w:type="dxa"/>
+              <w:bottom w:w="100" w:type="dxa"/>
+              <w:left w:w="150" w:type="dxa"/>
+              <w:right w:w="150" w:type="dxa"/>
+            </w:tcMar>
           </w:tcPr>
           <w:p>
+            <w:pPr>
+              <w:jc w:val="left"/>
+            </w:pPr>
             <w:r>
+              <w:rPr>
+                <w:rFonts w:ascii="Calibri" w:hAnsi="Calibri"/>
+                <w:color w:val="323232"/>
+                <w:sz w:val="20"/>
+              </w:rPr>
               <w:t>Styling</w:t>
             </w:r>
           </w:p>
         </w:tc>
         <w:tc>
           <w:tcPr>
-            <w:tcW w:type="dxa" w:w="4320"/>
+            <w:tcW w:type="dxa" w:w="2880"/>
+            <w:shd w:fill="F2F4F7"/>
+            <w:tcMar>
+              <w:top w:w="100" w:type="dxa"/>
+              <w:bottom w:w="100" w:type="dxa"/>
+              <w:left w:w="150" w:type="dxa"/>
+              <w:right w:w="150" w:type="dxa"/>
+            </w:tcMar>
           </w:tcPr>
           <w:p>
+            <w:pPr>
+              <w:jc w:val="left"/>
+            </w:pPr>
             <w:r>
-              <w:t>TailwindCSS 4</w:t>
+              <w:rPr>
+                <w:rFonts w:ascii="Calibri" w:hAnsi="Calibri"/>
+                <w:color w:val="323232"/>
+                <w:sz w:val="20"/>
+              </w:rPr>
+              <w:t>Tailwind CSS</w:t>
+            </w:r>
+          </w:p>
+        </w:tc>
+        <w:tc>
+          <w:tcPr>
+            <w:tcW w:type="dxa" w:w="3600"/>
+            <w:shd w:fill="F2F4F7"/>
+            <w:tcMar>
+              <w:top w:w="100" w:type="dxa"/>
+              <w:bottom w:w="100" w:type="dxa"/>
+              <w:left w:w="150" w:type="dxa"/>
+              <w:right w:w="150" w:type="dxa"/>
+            </w:tcMar>
+          </w:tcPr>
+          <w:p>
+            <w:pPr>
+              <w:jc w:val="left"/>
+            </w:pPr>
+            <w:r>
+              <w:rPr>
+                <w:rFonts w:ascii="Calibri" w:hAnsi="Calibri"/>
+                <w:color w:val="323232"/>
+                <w:sz w:val="20"/>
+              </w:rPr>
+              <w:t>^4.2.2</w:t>
             </w:r>
           </w:p>
         </w:tc>
@@ -122,21 +308,181 @@
       <w:tr>
         <w:tc>
           <w:tcPr>
-            <w:tcW w:type="dxa" w:w="4320"/>
+            <w:tcW w:type="dxa" w:w="2880"/>
+            <w:shd w:fill="FFFFFF"/>
+            <w:tcMar>
+              <w:top w:w="100" w:type="dxa"/>
+              <w:bottom w:w="100" w:type="dxa"/>
+              <w:left w:w="150" w:type="dxa"/>
+              <w:right w:w="150" w:type="dxa"/>
+            </w:tcMar>
           </w:tcPr>
           <w:p>
+            <w:pPr>
+              <w:jc w:val="left"/>
+            </w:pPr>
             <w:r>
-              <w:t>Backend Framework</w:t>
+              <w:rPr>
+                <w:rFonts w:ascii="Calibri" w:hAnsi="Calibri"/>
+                <w:color w:val="323232"/>
+                <w:sz w:val="20"/>
+              </w:rPr>
+              <w:t>Language</w:t>
             </w:r>
           </w:p>
         </w:tc>
         <w:tc>
           <w:tcPr>
-            <w:tcW w:type="dxa" w:w="4320"/>
+            <w:tcW w:type="dxa" w:w="2880"/>
+            <w:shd w:fill="FFFFFF"/>
+            <w:tcMar>
+              <w:top w:w="100" w:type="dxa"/>
+              <w:bottom w:w="100" w:type="dxa"/>
+              <w:left w:w="150" w:type="dxa"/>
+              <w:right w:w="150" w:type="dxa"/>
+            </w:tcMar>
           </w:tcPr>
           <w:p>
+            <w:pPr>
+              <w:jc w:val="left"/>
+            </w:pPr>
             <w:r>
-              <w:t>FastAPI (Python)</w:t>
+              <w:rPr>
+                <w:rFonts w:ascii="Calibri" w:hAnsi="Calibri"/>
+                <w:color w:val="323232"/>
+                <w:sz w:val="20"/>
+              </w:rPr>
+              <w:t>JavaScript (ES6+)</w:t>
+            </w:r>
+          </w:p>
+        </w:tc>
+        <w:tc>
+          <w:tcPr>
+            <w:tcW w:type="dxa" w:w="3600"/>
+            <w:shd w:fill="FFFFFF"/>
+            <w:tcMar>
+              <w:top w:w="100" w:type="dxa"/>
+              <w:bottom w:w="100" w:type="dxa"/>
+              <w:left w:w="150" w:type="dxa"/>
+              <w:right w:w="150" w:type="dxa"/>
+            </w:tcMar>
+          </w:tcPr>
+          <w:p>
+            <w:pPr>
+              <w:jc w:val="left"/>
+            </w:pPr>
+            <w:r>
+              <w:rPr>
+                <w:rFonts w:ascii="Calibri" w:hAnsi="Calibri"/>
+                <w:color w:val="323232"/>
+                <w:sz w:val="20"/>
+              </w:rPr>
+              <w:t>With JSX</w:t>
+            </w:r>
+          </w:p>
+        </w:tc>
+      </w:tr>
+    </w:tbl>
+    <w:p/>
+    <w:p>
+      <w:pPr>
+        <w:pStyle w:val="Heading2"/>
+      </w:pPr>
+      <w:r>
+        <w:rPr>
+          <w:color w:val="2E75B6"/>
+        </w:rPr>
+        <w:t>Backend Framework &amp; Database</w:t>
+      </w:r>
+    </w:p>
+    <w:tbl>
+      <w:tblPr>
+        <w:tblW w:type="auto" w:w="0"/>
+        <w:jc w:val="center"/>
+        <w:tblLayout w:type="fixed"/>
+        <w:tblLook w:firstColumn="1" w:firstRow="1" w:lastColumn="0" w:lastRow="0" w:noHBand="0" w:noVBand="1" w:val="04A0"/>
+      </w:tblPr>
+      <w:tblGrid>
+        <w:gridCol w:w="3120"/>
+        <w:gridCol w:w="3120"/>
+        <w:gridCol w:w="3120"/>
+      </w:tblGrid>
+      <w:tr>
+        <w:tc>
+          <w:tcPr>
+            <w:tcW w:type="dxa" w:w="2880"/>
+            <w:shd w:fill="1F4E78"/>
+            <w:tcMar>
+              <w:top w:w="120" w:type="dxa"/>
+              <w:bottom w:w="120" w:type="dxa"/>
+              <w:left w:w="150" w:type="dxa"/>
+              <w:right w:w="150" w:type="dxa"/>
+            </w:tcMar>
+          </w:tcPr>
+          <w:p>
+            <w:pPr>
+              <w:jc w:val="left"/>
+            </w:pPr>
+            <w:r>
+              <w:rPr>
+                <w:rFonts w:ascii="Calibri" w:hAnsi="Calibri"/>
+                <w:b/>
+                <w:color w:val="FFFFFF"/>
+                <w:sz w:val="21"/>
+              </w:rPr>
+              <w:t>Component</w:t>
+            </w:r>
+          </w:p>
+        </w:tc>
+        <w:tc>
+          <w:tcPr>
+            <w:tcW w:type="dxa" w:w="2880"/>
+            <w:shd w:fill="1F4E78"/>
+            <w:tcMar>
+              <w:top w:w="120" w:type="dxa"/>
+              <w:bottom w:w="120" w:type="dxa"/>
+              <w:left w:w="150" w:type="dxa"/>
+              <w:right w:w="150" w:type="dxa"/>
+            </w:tcMar>
+          </w:tcPr>
+          <w:p>
+            <w:pPr>
+              <w:jc w:val="left"/>
+            </w:pPr>
+            <w:r>
+              <w:rPr>
+                <w:rFonts w:ascii="Calibri" w:hAnsi="Calibri"/>
+                <w:b/>
+                <w:color w:val="FFFFFF"/>
+                <w:sz w:val="21"/>
+              </w:rPr>
+              <w:t>Technology</w:t>
+            </w:r>
+          </w:p>
+        </w:tc>
+        <w:tc>
+          <w:tcPr>
+            <w:tcW w:type="dxa" w:w="3600"/>
+            <w:shd w:fill="1F4E78"/>
+            <w:tcMar>
+              <w:top w:w="120" w:type="dxa"/>
+              <w:bottom w:w="120" w:type="dxa"/>
+              <w:left w:w="150" w:type="dxa"/>
+              <w:right w:w="150" w:type="dxa"/>
+            </w:tcMar>
+          </w:tcPr>
+          <w:p>
+            <w:pPr>
+              <w:jc w:val="left"/>
+            </w:pPr>
+            <w:r>
+              <w:rPr>
+                <w:rFonts w:ascii="Calibri" w:hAnsi="Calibri"/>
+                <w:b/>
+                <w:color w:val="FFFFFF"/>
+                <w:sz w:val="21"/>
+              </w:rPr>
+              <w:t>Version / Detail</w:t>
             </w:r>
           </w:p>
         </w:tc>
@@ -144,21 +490,76 @@
       <w:tr>
         <w:tc>
           <w:tcPr>
-            <w:tcW w:type="dxa" w:w="4320"/>
+            <w:tcW w:type="dxa" w:w="2880"/>
+            <w:shd w:fill="FFFFFF"/>
+            <w:tcMar>
+              <w:top w:w="100" w:type="dxa"/>
+              <w:bottom w:w="100" w:type="dxa"/>
+              <w:left w:w="150" w:type="dxa"/>
+              <w:right w:w="150" w:type="dxa"/>
+            </w:tcMar>
           </w:tcPr>
           <w:p>
+            <w:pPr>
+              <w:jc w:val="left"/>
+            </w:pPr>
             <w:r>
-              <w:t>Database</w:t>
+              <w:rPr>
+                <w:rFonts w:ascii="Calibri" w:hAnsi="Calibri"/>
+                <w:color w:val="323232"/>
+                <w:sz w:val="20"/>
+              </w:rPr>
+              <w:t>Backend Framework</w:t>
             </w:r>
           </w:p>
         </w:tc>
         <w:tc>
           <w:tcPr>
-            <w:tcW w:type="dxa" w:w="4320"/>
+            <w:tcW w:type="dxa" w:w="2880"/>
+            <w:shd w:fill="FFFFFF"/>
+            <w:tcMar>
+              <w:top w:w="100" w:type="dxa"/>
+              <w:bottom w:w="100" w:type="dxa"/>
+              <w:left w:w="150" w:type="dxa"/>
+              <w:right w:w="150" w:type="dxa"/>
+            </w:tcMar>
           </w:tcPr>
           <w:p>
+            <w:pPr>
+              <w:jc w:val="left"/>
+            </w:pPr>
             <w:r>
-              <w:t>SQLite (Development) / PostgreSQL (Optional)</w:t>
+              <w:rPr>
+                <w:rFonts w:ascii="Calibri" w:hAnsi="Calibri"/>
+                <w:color w:val="323232"/>
+                <w:sz w:val="20"/>
+              </w:rPr>
+              <w:t>FastAPI</w:t>
+            </w:r>
+          </w:p>
+        </w:tc>
+        <w:tc>
+          <w:tcPr>
+            <w:tcW w:type="dxa" w:w="3600"/>
+            <w:shd w:fill="FFFFFF"/>
+            <w:tcMar>
+              <w:top w:w="100" w:type="dxa"/>
+              <w:bottom w:w="100" w:type="dxa"/>
+              <w:left w:w="150" w:type="dxa"/>
+              <w:right w:w="150" w:type="dxa"/>
+            </w:tcMar>
+          </w:tcPr>
+          <w:p>
+            <w:pPr>
+              <w:jc w:val="left"/>
+            </w:pPr>
+            <w:r>
+              <w:rPr>
+                <w:rFonts w:ascii="Calibri" w:hAnsi="Calibri"/>
+                <w:color w:val="323232"/>
+                <w:sz w:val="20"/>
+              </w:rPr>
+              <w:t>High-performance Python API framework</w:t>
             </w:r>
           </w:p>
         </w:tc>
@@ -166,21 +567,76 @@
       <w:tr>
         <w:tc>
           <w:tcPr>
-            <w:tcW w:type="dxa" w:w="4320"/>
+            <w:tcW w:type="dxa" w:w="2880"/>
+            <w:shd w:fill="F2F4F7"/>
+            <w:tcMar>
+              <w:top w:w="100" w:type="dxa"/>
+              <w:bottom w:w="100" w:type="dxa"/>
+              <w:left w:w="150" w:type="dxa"/>
+              <w:right w:w="150" w:type="dxa"/>
+            </w:tcMar>
           </w:tcPr>
           <w:p>
+            <w:pPr>
+              <w:jc w:val="left"/>
+            </w:pPr>
             <w:r>
-              <w:t>ORM</w:t>
+              <w:rPr>
+                <w:rFonts w:ascii="Calibri" w:hAnsi="Calibri"/>
+                <w:color w:val="323232"/>
+                <w:sz w:val="20"/>
+              </w:rPr>
+              <w:t>ASGI Server</w:t>
             </w:r>
           </w:p>
         </w:tc>
         <w:tc>
           <w:tcPr>
-            <w:tcW w:type="dxa" w:w="4320"/>
+            <w:tcW w:type="dxa" w:w="2880"/>
+            <w:shd w:fill="F2F4F7"/>
+            <w:tcMar>
+              <w:top w:w="100" w:type="dxa"/>
+              <w:bottom w:w="100" w:type="dxa"/>
+              <w:left w:w="150" w:type="dxa"/>
+              <w:right w:w="150" w:type="dxa"/>
+            </w:tcMar>
           </w:tcPr>
           <w:p>
+            <w:pPr>
+              <w:jc w:val="left"/>
+            </w:pPr>
             <w:r>
-              <w:t>SQLAlchemy</w:t>
+              <w:rPr>
+                <w:rFonts w:ascii="Calibri" w:hAnsi="Calibri"/>
+                <w:color w:val="323232"/>
+                <w:sz w:val="20"/>
+              </w:rPr>
+              <w:t>Uvicorn</w:t>
+            </w:r>
+          </w:p>
+        </w:tc>
+        <w:tc>
+          <w:tcPr>
+            <w:tcW w:type="dxa" w:w="3600"/>
+            <w:shd w:fill="F2F4F7"/>
+            <w:tcMar>
+              <w:top w:w="100" w:type="dxa"/>
+              <w:bottom w:w="100" w:type="dxa"/>
+              <w:left w:w="150" w:type="dxa"/>
+              <w:right w:w="150" w:type="dxa"/>
+            </w:tcMar>
+          </w:tcPr>
+          <w:p>
+            <w:pPr>
+              <w:jc w:val="left"/>
+            </w:pPr>
+            <w:r>
+              <w:rPr>
+                <w:rFonts w:ascii="Calibri" w:hAnsi="Calibri"/>
+                <w:color w:val="323232"/>
+                <w:sz w:val="20"/>
+              </w:rPr>
+              <w:t>[standard] for production-grade serving</w:t>
             </w:r>
           </w:p>
         </w:tc>
@@ -188,21 +644,76 @@
       <w:tr>
         <w:tc>
           <w:tcPr>
-            <w:tcW w:type="dxa" w:w="4320"/>
+            <w:tcW w:type="dxa" w:w="2880"/>
+            <w:shd w:fill="FFFFFF"/>
+            <w:tcMar>
+              <w:top w:w="100" w:type="dxa"/>
+              <w:bottom w:w="100" w:type="dxa"/>
+              <w:left w:w="150" w:type="dxa"/>
+              <w:right w:w="150" w:type="dxa"/>
+            </w:tcMar>
           </w:tcPr>
           <w:p>
+            <w:pPr>
+              <w:jc w:val="left"/>
+            </w:pPr>
             <w:r>
-              <w:t>AI/OCR</w:t>
+              <w:rPr>
+                <w:rFonts w:ascii="Calibri" w:hAnsi="Calibri"/>
+                <w:color w:val="323232"/>
+                <w:sz w:val="20"/>
+              </w:rPr>
+              <w:t>Database</w:t>
             </w:r>
           </w:p>
         </w:tc>
         <w:tc>
           <w:tcPr>
-            <w:tcW w:type="dxa" w:w="4320"/>
+            <w:tcW w:type="dxa" w:w="2880"/>
+            <w:shd w:fill="FFFFFF"/>
+            <w:tcMar>
+              <w:top w:w="100" w:type="dxa"/>
+              <w:bottom w:w="100" w:type="dxa"/>
+              <w:left w:w="150" w:type="dxa"/>
+              <w:right w:w="150" w:type="dxa"/>
+            </w:tcMar>
           </w:tcPr>
           <w:p>
+            <w:pPr>
+              <w:jc w:val="left"/>
+            </w:pPr>
             <w:r>
-              <w:t>PyTesseract (Tesseract OCR), Pillow</w:t>
+              <w:rPr>
+                <w:rFonts w:ascii="Calibri" w:hAnsi="Calibri"/>
+                <w:color w:val="323232"/>
+                <w:sz w:val="20"/>
+              </w:rPr>
+              <w:t>SQLite</w:t>
+            </w:r>
+          </w:p>
+        </w:tc>
+        <w:tc>
+          <w:tcPr>
+            <w:tcW w:type="dxa" w:w="3600"/>
+            <w:shd w:fill="FFFFFF"/>
+            <w:tcMar>
+              <w:top w:w="100" w:type="dxa"/>
+              <w:bottom w:w="100" w:type="dxa"/>
+              <w:left w:w="150" w:type="dxa"/>
+              <w:right w:w="150" w:type="dxa"/>
+            </w:tcMar>
+          </w:tcPr>
+          <w:p>
+            <w:pPr>
+              <w:jc w:val="left"/>
+            </w:pPr>
+            <w:r>
+              <w:rPr>
+                <w:rFonts w:ascii="Calibri" w:hAnsi="Calibri"/>
+                <w:color w:val="323232"/>
+                <w:sz w:val="20"/>
+              </w:rPr>
+              <w:t>Development / Local deployment (.db files)</w:t>
             </w:r>
           </w:p>
         </w:tc>
@@ -210,21 +721,76 @@
       <w:tr>
         <w:tc>
           <w:tcPr>
-            <w:tcW w:type="dxa" w:w="4320"/>
+            <w:tcW w:type="dxa" w:w="2880"/>
+            <w:shd w:fill="F2F4F7"/>
+            <w:tcMar>
+              <w:top w:w="100" w:type="dxa"/>
+              <w:bottom w:w="100" w:type="dxa"/>
+              <w:left w:w="150" w:type="dxa"/>
+              <w:right w:w="150" w:type="dxa"/>
+            </w:tcMar>
           </w:tcPr>
           <w:p>
+            <w:pPr>
+              <w:jc w:val="left"/>
+            </w:pPr>
             <w:r>
-              <w:t>Machine Learning</w:t>
+              <w:rPr>
+                <w:rFonts w:ascii="Calibri" w:hAnsi="Calibri"/>
+                <w:color w:val="323232"/>
+                <w:sz w:val="20"/>
+              </w:rPr>
+              <w:t>ORM</w:t>
             </w:r>
           </w:p>
         </w:tc>
         <w:tc>
           <w:tcPr>
-            <w:tcW w:type="dxa" w:w="4320"/>
+            <w:tcW w:type="dxa" w:w="2880"/>
+            <w:shd w:fill="F2F4F7"/>
+            <w:tcMar>
+              <w:top w:w="100" w:type="dxa"/>
+              <w:bottom w:w="100" w:type="dxa"/>
+              <w:left w:w="150" w:type="dxa"/>
+              <w:right w:w="150" w:type="dxa"/>
+            </w:tcMar>
           </w:tcPr>
           <w:p>
+            <w:pPr>
+              <w:jc w:val="left"/>
+            </w:pPr>
             <w:r>
-              <w:t>Scikit-learn, Pandas, NumPy</w:t>
+              <w:rPr>
+                <w:rFonts w:ascii="Calibri" w:hAnsi="Calibri"/>
+                <w:color w:val="323232"/>
+                <w:sz w:val="20"/>
+              </w:rPr>
+              <w:t>SQLAlchemy</w:t>
+            </w:r>
+          </w:p>
+        </w:tc>
+        <w:tc>
+          <w:tcPr>
+            <w:tcW w:type="dxa" w:w="3600"/>
+            <w:shd w:fill="F2F4F7"/>
+            <w:tcMar>
+              <w:top w:w="100" w:type="dxa"/>
+              <w:bottom w:w="100" w:type="dxa"/>
+              <w:left w:w="150" w:type="dxa"/>
+              <w:right w:w="150" w:type="dxa"/>
+            </w:tcMar>
+          </w:tcPr>
+          <w:p>
+            <w:pPr>
+              <w:jc w:val="left"/>
+            </w:pPr>
+            <w:r>
+              <w:rPr>
+                <w:rFonts w:ascii="Calibri" w:hAnsi="Calibri"/>
+                <w:color w:val="323232"/>
+                <w:sz w:val="20"/>
+              </w:rPr>
+              <w:t>Relational database object mapping</w:t>
             </w:r>
           </w:p>
         </w:tc>
@@ -232,62 +798,76 @@
       <w:tr>
         <w:tc>
           <w:tcPr>
-            <w:tcW w:type="dxa" w:w="4320"/>
+            <w:tcW w:type="dxa" w:w="2880"/>
+            <w:shd w:fill="FFFFFF"/>
+            <w:tcMar>
+              <w:top w:w="100" w:type="dxa"/>
+              <w:bottom w:w="100" w:type="dxa"/>
+              <w:left w:w="150" w:type="dxa"/>
+              <w:right w:w="150" w:type="dxa"/>
+            </w:tcMar>
           </w:tcPr>
           <w:p>
+            <w:pPr>
+              <w:jc w:val="left"/>
+            </w:pPr>
             <w:r>
-              <w:t>API Documentation</w:t>
+              <w:rPr>
+                <w:rFonts w:ascii="Calibri" w:hAnsi="Calibri"/>
+                <w:color w:val="323232"/>
+                <w:sz w:val="20"/>
+              </w:rPr>
+              <w:t>Data Validation</w:t>
             </w:r>
           </w:p>
         </w:tc>
         <w:tc>
           <w:tcPr>
-            <w:tcW w:type="dxa" w:w="4320"/>
+            <w:tcW w:type="dxa" w:w="2880"/>
+            <w:shd w:fill="FFFFFF"/>
+            <w:tcMar>
+              <w:top w:w="100" w:type="dxa"/>
+              <w:bottom w:w="100" w:type="dxa"/>
+              <w:left w:w="150" w:type="dxa"/>
+              <w:right w:w="150" w:type="dxa"/>
+            </w:tcMar>
           </w:tcPr>
           <w:p>
+            <w:pPr>
+              <w:jc w:val="left"/>
+            </w:pPr>
             <w:r>
-              <w:t>Swagger UI / Redoc (Built-in FastAPI)</w:t>
-            </w:r>
-          </w:p>
-        </w:tc>
-      </w:tr>
-    </w:tbl>
-    <w:p>
-      <w:pPr>
-        <w:pStyle w:val="Heading1"/>
-      </w:pPr>
-      <w:r>
-        <w:t>2. Software Applications Used</w:t>
-      </w:r>
-    </w:p>
-    <w:tbl>
-      <w:tblPr>
-        <w:tblStyle w:val="TableGrid"/>
-        <w:tblW w:type="auto" w:w="0"/>
-        <w:tblLook w:firstColumn="1" w:firstRow="1" w:lastColumn="0" w:lastRow="0" w:noHBand="0" w:noVBand="1" w:val="04A0"/>
-      </w:tblPr>
-      <w:tblGrid>
-        <w:gridCol w:w="4320"/>
-        <w:gridCol w:w="4320"/>
-      </w:tblGrid>
-      <w:tr>
-        <w:tc>
-          <w:tcPr>
-            <w:tcW w:type="dxa" w:w="4320"/>
-          </w:tcPr>
-          <w:p>
-            <w:r>
-              <w:t>Application</w:t>
+              <w:rPr>
+                <w:rFonts w:ascii="Calibri" w:hAnsi="Calibri"/>
+                <w:color w:val="323232"/>
+                <w:sz w:val="20"/>
+              </w:rPr>
+              <w:t>Pydantic</w:t>
             </w:r>
           </w:p>
         </w:tc>
         <w:tc>
           <w:tcPr>
-            <w:tcW w:type="dxa" w:w="4320"/>
+            <w:tcW w:type="dxa" w:w="3600"/>
+            <w:shd w:fill="FFFFFF"/>
+            <w:tcMar>
+              <w:top w:w="100" w:type="dxa"/>
+              <w:bottom w:w="100" w:type="dxa"/>
+              <w:left w:w="150" w:type="dxa"/>
+              <w:right w:w="150" w:type="dxa"/>
+            </w:tcMar>
           </w:tcPr>
           <w:p>
+            <w:pPr>
+              <w:jc w:val="left"/>
+            </w:pPr>
             <w:r>
-              <w:t>Version / Role</w:t>
+              <w:rPr>
+                <w:rFonts w:ascii="Calibri" w:hAnsi="Calibri"/>
+                <w:color w:val="323232"/>
+                <w:sz w:val="20"/>
+              </w:rPr>
+              <w:t>Schema and type validation</w:t>
             </w:r>
           </w:p>
         </w:tc>
@@ -295,21 +875,76 @@
       <w:tr>
         <w:tc>
           <w:tcPr>
-            <w:tcW w:type="dxa" w:w="4320"/>
+            <w:tcW w:type="dxa" w:w="2880"/>
+            <w:shd w:fill="F2F4F7"/>
+            <w:tcMar>
+              <w:top w:w="100" w:type="dxa"/>
+              <w:bottom w:w="100" w:type="dxa"/>
+              <w:left w:w="150" w:type="dxa"/>
+              <w:right w:w="150" w:type="dxa"/>
+            </w:tcMar>
           </w:tcPr>
           <w:p>
+            <w:pPr>
+              <w:jc w:val="left"/>
+            </w:pPr>
             <w:r>
-              <w:t>Visual Studio Code</w:t>
+              <w:rPr>
+                <w:rFonts w:ascii="Calibri" w:hAnsi="Calibri"/>
+                <w:color w:val="323232"/>
+                <w:sz w:val="20"/>
+              </w:rPr>
+              <w:t>Authentication</w:t>
             </w:r>
           </w:p>
         </w:tc>
         <w:tc>
           <w:tcPr>
-            <w:tcW w:type="dxa" w:w="4320"/>
+            <w:tcW w:type="dxa" w:w="2880"/>
+            <w:shd w:fill="F2F4F7"/>
+            <w:tcMar>
+              <w:top w:w="100" w:type="dxa"/>
+              <w:bottom w:w="100" w:type="dxa"/>
+              <w:left w:w="150" w:type="dxa"/>
+              <w:right w:w="150" w:type="dxa"/>
+            </w:tcMar>
           </w:tcPr>
           <w:p>
+            <w:pPr>
+              <w:jc w:val="left"/>
+            </w:pPr>
             <w:r>
-              <w:t>Current Stable (IDE)</w:t>
+              <w:rPr>
+                <w:rFonts w:ascii="Calibri" w:hAnsi="Calibri"/>
+                <w:color w:val="323232"/>
+                <w:sz w:val="20"/>
+              </w:rPr>
+              <w:t>Passlib, python-jose</w:t>
+            </w:r>
+          </w:p>
+        </w:tc>
+        <w:tc>
+          <w:tcPr>
+            <w:tcW w:type="dxa" w:w="3600"/>
+            <w:shd w:fill="F2F4F7"/>
+            <w:tcMar>
+              <w:top w:w="100" w:type="dxa"/>
+              <w:bottom w:w="100" w:type="dxa"/>
+              <w:left w:w="150" w:type="dxa"/>
+              <w:right w:w="150" w:type="dxa"/>
+            </w:tcMar>
+          </w:tcPr>
+          <w:p>
+            <w:pPr>
+              <w:jc w:val="left"/>
+            </w:pPr>
+            <w:r>
+              <w:rPr>
+                <w:rFonts w:ascii="Calibri" w:hAnsi="Calibri"/>
+                <w:color w:val="323232"/>
+                <w:sz w:val="20"/>
+              </w:rPr>
+              <w:t>Password hashing and JWT authentication</w:t>
             </w:r>
           </w:p>
         </w:tc>
@@ -317,21 +952,181 @@
       <w:tr>
         <w:tc>
           <w:tcPr>
-            <w:tcW w:type="dxa" w:w="4320"/>
+            <w:tcW w:type="dxa" w:w="2880"/>
+            <w:shd w:fill="FFFFFF"/>
+            <w:tcMar>
+              <w:top w:w="100" w:type="dxa"/>
+              <w:bottom w:w="100" w:type="dxa"/>
+              <w:left w:w="150" w:type="dxa"/>
+              <w:right w:w="150" w:type="dxa"/>
+            </w:tcMar>
           </w:tcPr>
           <w:p>
+            <w:pPr>
+              <w:jc w:val="left"/>
+            </w:pPr>
             <w:r>
-              <w:t>Python</w:t>
+              <w:rPr>
+                <w:rFonts w:ascii="Calibri" w:hAnsi="Calibri"/>
+                <w:color w:val="323232"/>
+                <w:sz w:val="20"/>
+              </w:rPr>
+              <w:t>API Documentation</w:t>
             </w:r>
           </w:p>
         </w:tc>
         <w:tc>
           <w:tcPr>
-            <w:tcW w:type="dxa" w:w="4320"/>
+            <w:tcW w:type="dxa" w:w="2880"/>
+            <w:shd w:fill="FFFFFF"/>
+            <w:tcMar>
+              <w:top w:w="100" w:type="dxa"/>
+              <w:bottom w:w="100" w:type="dxa"/>
+              <w:left w:w="150" w:type="dxa"/>
+              <w:right w:w="150" w:type="dxa"/>
+            </w:tcMar>
           </w:tcPr>
           <w:p>
+            <w:pPr>
+              <w:jc w:val="left"/>
+            </w:pPr>
             <w:r>
-              <w:t>3.10+ (Backend Runtime)</w:t>
+              <w:rPr>
+                <w:rFonts w:ascii="Calibri" w:hAnsi="Calibri"/>
+                <w:color w:val="323232"/>
+                <w:sz w:val="20"/>
+              </w:rPr>
+              <w:t>Swagger UI / Redoc</w:t>
+            </w:r>
+          </w:p>
+        </w:tc>
+        <w:tc>
+          <w:tcPr>
+            <w:tcW w:type="dxa" w:w="3600"/>
+            <w:shd w:fill="FFFFFF"/>
+            <w:tcMar>
+              <w:top w:w="100" w:type="dxa"/>
+              <w:bottom w:w="100" w:type="dxa"/>
+              <w:left w:w="150" w:type="dxa"/>
+              <w:right w:w="150" w:type="dxa"/>
+            </w:tcMar>
+          </w:tcPr>
+          <w:p>
+            <w:pPr>
+              <w:jc w:val="left"/>
+            </w:pPr>
+            <w:r>
+              <w:rPr>
+                <w:rFonts w:ascii="Calibri" w:hAnsi="Calibri"/>
+                <w:color w:val="323232"/>
+                <w:sz w:val="20"/>
+              </w:rPr>
+              <w:t>Built-in FastAPI interactive documentation</w:t>
+            </w:r>
+          </w:p>
+        </w:tc>
+      </w:tr>
+    </w:tbl>
+    <w:p/>
+    <w:p>
+      <w:pPr>
+        <w:pStyle w:val="Heading2"/>
+      </w:pPr>
+      <w:r>
+        <w:rPr>
+          <w:color w:val="2E75B6"/>
+        </w:rPr>
+        <w:t>AI &amp; Machine Learning Integrations</w:t>
+      </w:r>
+    </w:p>
+    <w:tbl>
+      <w:tblPr>
+        <w:tblW w:type="auto" w:w="0"/>
+        <w:jc w:val="center"/>
+        <w:tblLayout w:type="fixed"/>
+        <w:tblLook w:firstColumn="1" w:firstRow="1" w:lastColumn="0" w:lastRow="0" w:noHBand="0" w:noVBand="1" w:val="04A0"/>
+      </w:tblPr>
+      <w:tblGrid>
+        <w:gridCol w:w="3120"/>
+        <w:gridCol w:w="3120"/>
+        <w:gridCol w:w="3120"/>
+      </w:tblGrid>
+      <w:tr>
+        <w:tc>
+          <w:tcPr>
+            <w:tcW w:type="dxa" w:w="2880"/>
+            <w:shd w:fill="1F4E78"/>
+            <w:tcMar>
+              <w:top w:w="120" w:type="dxa"/>
+              <w:bottom w:w="120" w:type="dxa"/>
+              <w:left w:w="150" w:type="dxa"/>
+              <w:right w:w="150" w:type="dxa"/>
+            </w:tcMar>
+          </w:tcPr>
+          <w:p>
+            <w:pPr>
+              <w:jc w:val="left"/>
+            </w:pPr>
+            <w:r>
+              <w:rPr>
+                <w:rFonts w:ascii="Calibri" w:hAnsi="Calibri"/>
+                <w:b/>
+                <w:color w:val="FFFFFF"/>
+                <w:sz w:val="21"/>
+              </w:rPr>
+              <w:t>Component</w:t>
+            </w:r>
+          </w:p>
+        </w:tc>
+        <w:tc>
+          <w:tcPr>
+            <w:tcW w:type="dxa" w:w="2880"/>
+            <w:shd w:fill="1F4E78"/>
+            <w:tcMar>
+              <w:top w:w="120" w:type="dxa"/>
+              <w:bottom w:w="120" w:type="dxa"/>
+              <w:left w:w="150" w:type="dxa"/>
+              <w:right w:w="150" w:type="dxa"/>
+            </w:tcMar>
+          </w:tcPr>
+          <w:p>
+            <w:pPr>
+              <w:jc w:val="left"/>
+            </w:pPr>
+            <w:r>
+              <w:rPr>
+                <w:rFonts w:ascii="Calibri" w:hAnsi="Calibri"/>
+                <w:b/>
+                <w:color w:val="FFFFFF"/>
+                <w:sz w:val="21"/>
+              </w:rPr>
+              <w:t>Technology</w:t>
+            </w:r>
+          </w:p>
+        </w:tc>
+        <w:tc>
+          <w:tcPr>
+            <w:tcW w:type="dxa" w:w="3600"/>
+            <w:shd w:fill="1F4E78"/>
+            <w:tcMar>
+              <w:top w:w="120" w:type="dxa"/>
+              <w:bottom w:w="120" w:type="dxa"/>
+              <w:left w:w="150" w:type="dxa"/>
+              <w:right w:w="150" w:type="dxa"/>
+            </w:tcMar>
+          </w:tcPr>
+          <w:p>
+            <w:pPr>
+              <w:jc w:val="left"/>
+            </w:pPr>
+            <w:r>
+              <w:rPr>
+                <w:rFonts w:ascii="Calibri" w:hAnsi="Calibri"/>
+                <w:b/>
+                <w:color w:val="FFFFFF"/>
+                <w:sz w:val="21"/>
+              </w:rPr>
+              <w:t>Role</w:t>
             </w:r>
           </w:p>
         </w:tc>
@@ -339,21 +1134,76 @@
       <w:tr>
         <w:tc>
           <w:tcPr>
-            <w:tcW w:type="dxa" w:w="4320"/>
+            <w:tcW w:type="dxa" w:w="2880"/>
+            <w:shd w:fill="FFFFFF"/>
+            <w:tcMar>
+              <w:top w:w="100" w:type="dxa"/>
+              <w:bottom w:w="100" w:type="dxa"/>
+              <w:left w:w="150" w:type="dxa"/>
+              <w:right w:w="150" w:type="dxa"/>
+            </w:tcMar>
           </w:tcPr>
           <w:p>
+            <w:pPr>
+              <w:jc w:val="left"/>
+            </w:pPr>
             <w:r>
-              <w:t>Node.js</w:t>
+              <w:rPr>
+                <w:rFonts w:ascii="Calibri" w:hAnsi="Calibri"/>
+                <w:color w:val="323232"/>
+                <w:sz w:val="20"/>
+              </w:rPr>
+              <w:t>Machine Learning</w:t>
             </w:r>
           </w:p>
         </w:tc>
         <w:tc>
           <w:tcPr>
-            <w:tcW w:type="dxa" w:w="4320"/>
+            <w:tcW w:type="dxa" w:w="2880"/>
+            <w:shd w:fill="FFFFFF"/>
+            <w:tcMar>
+              <w:top w:w="100" w:type="dxa"/>
+              <w:bottom w:w="100" w:type="dxa"/>
+              <w:left w:w="150" w:type="dxa"/>
+              <w:right w:w="150" w:type="dxa"/>
+            </w:tcMar>
           </w:tcPr>
           <w:p>
+            <w:pPr>
+              <w:jc w:val="left"/>
+            </w:pPr>
             <w:r>
-              <w:t>18+ (Frontend Runtime)</w:t>
+              <w:rPr>
+                <w:rFonts w:ascii="Calibri" w:hAnsi="Calibri"/>
+                <w:color w:val="323232"/>
+                <w:sz w:val="20"/>
+              </w:rPr>
+              <w:t>Scikit-learn, NumPy, Pandas</w:t>
+            </w:r>
+          </w:p>
+        </w:tc>
+        <w:tc>
+          <w:tcPr>
+            <w:tcW w:type="dxa" w:w="3600"/>
+            <w:shd w:fill="FFFFFF"/>
+            <w:tcMar>
+              <w:top w:w="100" w:type="dxa"/>
+              <w:bottom w:w="100" w:type="dxa"/>
+              <w:left w:w="150" w:type="dxa"/>
+              <w:right w:w="150" w:type="dxa"/>
+            </w:tcMar>
+          </w:tcPr>
+          <w:p>
+            <w:pPr>
+              <w:jc w:val="left"/>
+            </w:pPr>
+            <w:r>
+              <w:rPr>
+                <w:rFonts w:ascii="Calibri" w:hAnsi="Calibri"/>
+                <w:color w:val="323232"/>
+                <w:sz w:val="20"/>
+              </w:rPr>
+              <w:t>RandomForest &amp; GradientBoosting models for predictive academic and tuition risk tracking.</w:t>
             </w:r>
           </w:p>
         </w:tc>
@@ -361,21 +1211,181 @@
       <w:tr>
         <w:tc>
           <w:tcPr>
-            <w:tcW w:type="dxa" w:w="4320"/>
+            <w:tcW w:type="dxa" w:w="2880"/>
+            <w:shd w:fill="F2F4F7"/>
+            <w:tcMar>
+              <w:top w:w="100" w:type="dxa"/>
+              <w:bottom w:w="100" w:type="dxa"/>
+              <w:left w:w="150" w:type="dxa"/>
+              <w:right w:w="150" w:type="dxa"/>
+            </w:tcMar>
           </w:tcPr>
           <w:p>
+            <w:pPr>
+              <w:jc w:val="left"/>
+            </w:pPr>
             <w:r>
-              <w:t>Git</w:t>
+              <w:rPr>
+                <w:rFonts w:ascii="Calibri" w:hAnsi="Calibri"/>
+                <w:color w:val="323232"/>
+                <w:sz w:val="20"/>
+              </w:rPr>
+              <w:t>Generative AI</w:t>
+            </w:r>
+          </w:p>
+        </w:tc>
+        <w:tc>
+          <w:tcPr>
+            <w:tcW w:type="dxa" w:w="2880"/>
+            <w:shd w:fill="F2F4F7"/>
+            <w:tcMar>
+              <w:top w:w="100" w:type="dxa"/>
+              <w:bottom w:w="100" w:type="dxa"/>
+              <w:left w:w="150" w:type="dxa"/>
+              <w:right w:w="150" w:type="dxa"/>
+            </w:tcMar>
+          </w:tcPr>
+          <w:p>
+            <w:pPr>
+              <w:jc w:val="left"/>
+            </w:pPr>
+            <w:r>
+              <w:rPr>
+                <w:rFonts w:ascii="Calibri" w:hAnsi="Calibri"/>
+                <w:color w:val="323232"/>
+                <w:sz w:val="20"/>
+              </w:rPr>
+              <w:t>Google Generative AI</w:t>
+            </w:r>
+          </w:p>
+        </w:tc>
+        <w:tc>
+          <w:tcPr>
+            <w:tcW w:type="dxa" w:w="3600"/>
+            <w:shd w:fill="F2F4F7"/>
+            <w:tcMar>
+              <w:top w:w="100" w:type="dxa"/>
+              <w:bottom w:w="100" w:type="dxa"/>
+              <w:left w:w="150" w:type="dxa"/>
+              <w:right w:w="150" w:type="dxa"/>
+            </w:tcMar>
+          </w:tcPr>
+          <w:p>
+            <w:pPr>
+              <w:jc w:val="left"/>
+            </w:pPr>
+            <w:r>
+              <w:rPr>
+                <w:rFonts w:ascii="Calibri" w:hAnsi="Calibri"/>
+                <w:color w:val="323232"/>
+                <w:sz w:val="20"/>
+              </w:rPr>
+              <w:t>Integration with Gemini (2.0 Flash) for automated narrative report generation.</w:t>
+            </w:r>
+          </w:p>
+        </w:tc>
+      </w:tr>
+    </w:tbl>
+    <w:p/>
+    <w:p>
+      <w:pPr>
+        <w:pStyle w:val="Heading1"/>
+      </w:pPr>
+      <w:r>
+        <w:rPr>
+          <w:color w:val="1F4E78"/>
+        </w:rPr>
+        <w:t>2. Software Applications Used</w:t>
+      </w:r>
+    </w:p>
+    <w:tbl>
+      <w:tblPr>
+        <w:tblW w:type="auto" w:w="0"/>
+        <w:jc w:val="center"/>
+        <w:tblLayout w:type="fixed"/>
+        <w:tblLook w:firstColumn="1" w:firstRow="1" w:lastColumn="0" w:lastRow="0" w:noHBand="0" w:noVBand="1" w:val="04A0"/>
+      </w:tblPr>
+      <w:tblGrid>
+        <w:gridCol w:w="3120"/>
+        <w:gridCol w:w="3120"/>
+        <w:gridCol w:w="3120"/>
+      </w:tblGrid>
+      <w:tr>
+        <w:tc>
+          <w:tcPr>
+            <w:tcW w:type="dxa" w:w="2592"/>
+            <w:shd w:fill="1F4E78"/>
+            <w:tcMar>
+              <w:top w:w="120" w:type="dxa"/>
+              <w:bottom w:w="120" w:type="dxa"/>
+              <w:left w:w="150" w:type="dxa"/>
+              <w:right w:w="150" w:type="dxa"/>
+            </w:tcMar>
+          </w:tcPr>
+          <w:p>
+            <w:pPr>
+              <w:jc w:val="left"/>
+            </w:pPr>
+            <w:r>
+              <w:rPr>
+                <w:rFonts w:ascii="Calibri" w:hAnsi="Calibri"/>
+                <w:b/>
+                <w:color w:val="FFFFFF"/>
+                <w:sz w:val="21"/>
+              </w:rPr>
+              <w:t>Application</w:t>
+            </w:r>
+          </w:p>
+        </w:tc>
+        <w:tc>
+          <w:tcPr>
+            <w:tcW w:type="dxa" w:w="2448"/>
+            <w:shd w:fill="1F4E78"/>
+            <w:tcMar>
+              <w:top w:w="120" w:type="dxa"/>
+              <w:bottom w:w="120" w:type="dxa"/>
+              <w:left w:w="150" w:type="dxa"/>
+              <w:right w:w="150" w:type="dxa"/>
+            </w:tcMar>
+          </w:tcPr>
+          <w:p>
+            <w:pPr>
+              <w:jc w:val="left"/>
+            </w:pPr>
+            <w:r>
+              <w:rPr>
+                <w:rFonts w:ascii="Calibri" w:hAnsi="Calibri"/>
+                <w:b/>
+                <w:color w:val="FFFFFF"/>
+                <w:sz w:val="21"/>
+              </w:rPr>
+              <w:t>Version / Role</w:t>
             </w:r>
           </w:p>
         </w:tc>
         <w:tc>
           <w:tcPr>
             <w:tcW w:type="dxa" w:w="4320"/>
+            <w:shd w:fill="1F4E78"/>
+            <w:tcMar>
+              <w:top w:w="120" w:type="dxa"/>
+              <w:bottom w:w="120" w:type="dxa"/>
+              <w:left w:w="150" w:type="dxa"/>
+              <w:right w:w="150" w:type="dxa"/>
+            </w:tcMar>
           </w:tcPr>
           <w:p>
+            <w:pPr>
+              <w:jc w:val="left"/>
+            </w:pPr>
             <w:r>
-              <w:t>Version Control System</w:t>
+              <w:rPr>
+                <w:rFonts w:ascii="Calibri" w:hAnsi="Calibri"/>
+                <w:b/>
+                <w:color w:val="FFFFFF"/>
+                <w:sz w:val="21"/>
+              </w:rPr>
+              <w:t>Description</w:t>
             </w:r>
           </w:p>
         </w:tc>
@@ -383,21 +1393,76 @@
       <w:tr>
         <w:tc>
           <w:tcPr>
-            <w:tcW w:type="dxa" w:w="4320"/>
+            <w:tcW w:type="dxa" w:w="2592"/>
+            <w:shd w:fill="FFFFFF"/>
+            <w:tcMar>
+              <w:top w:w="100" w:type="dxa"/>
+              <w:bottom w:w="100" w:type="dxa"/>
+              <w:left w:w="150" w:type="dxa"/>
+              <w:right w:w="150" w:type="dxa"/>
+            </w:tcMar>
           </w:tcPr>
           <w:p>
+            <w:pPr>
+              <w:jc w:val="left"/>
+            </w:pPr>
             <w:r>
-              <w:t>Postman</w:t>
+              <w:rPr>
+                <w:rFonts w:ascii="Calibri" w:hAnsi="Calibri"/>
+                <w:color w:val="323232"/>
+                <w:sz w:val="20"/>
+              </w:rPr>
+              <w:t>Visual Studio Code</w:t>
+            </w:r>
+          </w:p>
+        </w:tc>
+        <w:tc>
+          <w:tcPr>
+            <w:tcW w:type="dxa" w:w="2448"/>
+            <w:shd w:fill="FFFFFF"/>
+            <w:tcMar>
+              <w:top w:w="100" w:type="dxa"/>
+              <w:bottom w:w="100" w:type="dxa"/>
+              <w:left w:w="150" w:type="dxa"/>
+              <w:right w:w="150" w:type="dxa"/>
+            </w:tcMar>
+          </w:tcPr>
+          <w:p>
+            <w:pPr>
+              <w:jc w:val="left"/>
+            </w:pPr>
+            <w:r>
+              <w:rPr>
+                <w:rFonts w:ascii="Calibri" w:hAnsi="Calibri"/>
+                <w:color w:val="323232"/>
+                <w:sz w:val="20"/>
+              </w:rPr>
+              <w:t>Current Stable</w:t>
             </w:r>
           </w:p>
         </w:tc>
         <w:tc>
           <w:tcPr>
             <w:tcW w:type="dxa" w:w="4320"/>
+            <w:shd w:fill="FFFFFF"/>
+            <w:tcMar>
+              <w:top w:w="100" w:type="dxa"/>
+              <w:bottom w:w="100" w:type="dxa"/>
+              <w:left w:w="150" w:type="dxa"/>
+              <w:right w:w="150" w:type="dxa"/>
+            </w:tcMar>
           </w:tcPr>
           <w:p>
+            <w:pPr>
+              <w:jc w:val="left"/>
+            </w:pPr>
             <w:r>
-              <w:t>API Testing and Documentation</w:t>
+              <w:rPr>
+                <w:rFonts w:ascii="Calibri" w:hAnsi="Calibri"/>
+                <w:color w:val="323232"/>
+                <w:sz w:val="20"/>
+              </w:rPr>
+              <w:t>Primary Integrated Development Environment (IDE).</w:t>
             </w:r>
           </w:p>
         </w:tc>
@@ -405,21 +1470,76 @@
       <w:tr>
         <w:tc>
           <w:tcPr>
-            <w:tcW w:type="dxa" w:w="4320"/>
+            <w:tcW w:type="dxa" w:w="2592"/>
+            <w:shd w:fill="F2F4F7"/>
+            <w:tcMar>
+              <w:top w:w="100" w:type="dxa"/>
+              <w:bottom w:w="100" w:type="dxa"/>
+              <w:left w:w="150" w:type="dxa"/>
+              <w:right w:w="150" w:type="dxa"/>
+            </w:tcMar>
           </w:tcPr>
           <w:p>
+            <w:pPr>
+              <w:jc w:val="left"/>
+            </w:pPr>
             <w:r>
-              <w:t>Tesseract OCR</w:t>
+              <w:rPr>
+                <w:rFonts w:ascii="Calibri" w:hAnsi="Calibri"/>
+                <w:color w:val="323232"/>
+                <w:sz w:val="20"/>
+              </w:rPr>
+              <w:t>Python</w:t>
+            </w:r>
+          </w:p>
+        </w:tc>
+        <w:tc>
+          <w:tcPr>
+            <w:tcW w:type="dxa" w:w="2448"/>
+            <w:shd w:fill="F2F4F7"/>
+            <w:tcMar>
+              <w:top w:w="100" w:type="dxa"/>
+              <w:bottom w:w="100" w:type="dxa"/>
+              <w:left w:w="150" w:type="dxa"/>
+              <w:right w:w="150" w:type="dxa"/>
+            </w:tcMar>
+          </w:tcPr>
+          <w:p>
+            <w:pPr>
+              <w:jc w:val="left"/>
+            </w:pPr>
+            <w:r>
+              <w:rPr>
+                <w:rFonts w:ascii="Calibri" w:hAnsi="Calibri"/>
+                <w:color w:val="323232"/>
+                <w:sz w:val="20"/>
+              </w:rPr>
+              <w:t>3.10+</w:t>
             </w:r>
           </w:p>
         </w:tc>
         <w:tc>
           <w:tcPr>
             <w:tcW w:type="dxa" w:w="4320"/>
+            <w:shd w:fill="F2F4F7"/>
+            <w:tcMar>
+              <w:top w:w="100" w:type="dxa"/>
+              <w:bottom w:w="100" w:type="dxa"/>
+              <w:left w:w="150" w:type="dxa"/>
+              <w:right w:w="150" w:type="dxa"/>
+            </w:tcMar>
           </w:tcPr>
           <w:p>
+            <w:pPr>
+              <w:jc w:val="left"/>
+            </w:pPr>
             <w:r>
-              <w:t>v5.x (OCR Engine)</w:t>
+              <w:rPr>
+                <w:rFonts w:ascii="Calibri" w:hAnsi="Calibri"/>
+                <w:color w:val="323232"/>
+                <w:sz w:val="20"/>
+              </w:rPr>
+              <w:t>Backend runtime environment and ML execution.</w:t>
             </w:r>
           </w:p>
         </w:tc>
@@ -427,21 +1547,76 @@
       <w:tr>
         <w:tc>
           <w:tcPr>
-            <w:tcW w:type="dxa" w:w="4320"/>
+            <w:tcW w:type="dxa" w:w="2592"/>
+            <w:shd w:fill="FFFFFF"/>
+            <w:tcMar>
+              <w:top w:w="100" w:type="dxa"/>
+              <w:bottom w:w="100" w:type="dxa"/>
+              <w:left w:w="150" w:type="dxa"/>
+              <w:right w:w="150" w:type="dxa"/>
+            </w:tcMar>
           </w:tcPr>
           <w:p>
+            <w:pPr>
+              <w:jc w:val="left"/>
+            </w:pPr>
             <w:r>
-              <w:t>Vite</w:t>
+              <w:rPr>
+                <w:rFonts w:ascii="Calibri" w:hAnsi="Calibri"/>
+                <w:color w:val="323232"/>
+                <w:sz w:val="20"/>
+              </w:rPr>
+              <w:t>Node.js</w:t>
+            </w:r>
+          </w:p>
+        </w:tc>
+        <w:tc>
+          <w:tcPr>
+            <w:tcW w:type="dxa" w:w="2448"/>
+            <w:shd w:fill="FFFFFF"/>
+            <w:tcMar>
+              <w:top w:w="100" w:type="dxa"/>
+              <w:bottom w:w="100" w:type="dxa"/>
+              <w:left w:w="150" w:type="dxa"/>
+              <w:right w:w="150" w:type="dxa"/>
+            </w:tcMar>
+          </w:tcPr>
+          <w:p>
+            <w:pPr>
+              <w:jc w:val="left"/>
+            </w:pPr>
+            <w:r>
+              <w:rPr>
+                <w:rFonts w:ascii="Calibri" w:hAnsi="Calibri"/>
+                <w:color w:val="323232"/>
+                <w:sz w:val="20"/>
+              </w:rPr>
+              <w:t>18.0+</w:t>
             </w:r>
           </w:p>
         </w:tc>
         <w:tc>
           <w:tcPr>
             <w:tcW w:type="dxa" w:w="4320"/>
+            <w:shd w:fill="FFFFFF"/>
+            <w:tcMar>
+              <w:top w:w="100" w:type="dxa"/>
+              <w:bottom w:w="100" w:type="dxa"/>
+              <w:left w:w="150" w:type="dxa"/>
+              <w:right w:w="150" w:type="dxa"/>
+            </w:tcMar>
           </w:tcPr>
           <w:p>
+            <w:pPr>
+              <w:jc w:val="left"/>
+            </w:pPr>
             <w:r>
-              <w:t>Frontend Build Tool</w:t>
+              <w:rPr>
+                <w:rFonts w:ascii="Calibri" w:hAnsi="Calibri"/>
+                <w:color w:val="323232"/>
+                <w:sz w:val="20"/>
+              </w:rPr>
+              <w:t>Frontend runtime environment for Vite and npm.</w:t>
             </w:r>
           </w:p>
         </w:tc>
@@ -449,67 +1624,76 @@
       <w:tr>
         <w:tc>
           <w:tcPr>
-            <w:tcW w:type="dxa" w:w="4320"/>
+            <w:tcW w:type="dxa" w:w="2592"/>
+            <w:shd w:fill="F2F4F7"/>
+            <w:tcMar>
+              <w:top w:w="100" w:type="dxa"/>
+              <w:bottom w:w="100" w:type="dxa"/>
+              <w:left w:w="150" w:type="dxa"/>
+              <w:right w:w="150" w:type="dxa"/>
+            </w:tcMar>
           </w:tcPr>
           <w:p>
+            <w:pPr>
+              <w:jc w:val="left"/>
+            </w:pPr>
             <w:r>
-              <w:t>Microsoft Edge / Chrome</w:t>
+              <w:rPr>
+                <w:rFonts w:ascii="Calibri" w:hAnsi="Calibri"/>
+                <w:color w:val="323232"/>
+                <w:sz w:val="20"/>
+              </w:rPr>
+              <w:t>Git</w:t>
+            </w:r>
+          </w:p>
+        </w:tc>
+        <w:tc>
+          <w:tcPr>
+            <w:tcW w:type="dxa" w:w="2448"/>
+            <w:shd w:fill="F2F4F7"/>
+            <w:tcMar>
+              <w:top w:w="100" w:type="dxa"/>
+              <w:bottom w:w="100" w:type="dxa"/>
+              <w:left w:w="150" w:type="dxa"/>
+              <w:right w:w="150" w:type="dxa"/>
+            </w:tcMar>
+          </w:tcPr>
+          <w:p>
+            <w:pPr>
+              <w:jc w:val="left"/>
+            </w:pPr>
+            <w:r>
+              <w:rPr>
+                <w:rFonts w:ascii="Calibri" w:hAnsi="Calibri"/>
+                <w:color w:val="323232"/>
+                <w:sz w:val="20"/>
+              </w:rPr>
+              <w:t>Current Stable</w:t>
             </w:r>
           </w:p>
         </w:tc>
         <w:tc>
           <w:tcPr>
             <w:tcW w:type="dxa" w:w="4320"/>
+            <w:shd w:fill="F2F4F7"/>
+            <w:tcMar>
+              <w:top w:w="100" w:type="dxa"/>
+              <w:bottom w:w="100" w:type="dxa"/>
+              <w:left w:w="150" w:type="dxa"/>
+              <w:right w:w="150" w:type="dxa"/>
+            </w:tcMar>
           </w:tcPr>
           <w:p>
+            <w:pPr>
+              <w:jc w:val="left"/>
+            </w:pPr>
             <w:r>
-              <w:t>Modern Web Browsers</w:t>
-            </w:r>
-          </w:p>
-        </w:tc>
-      </w:tr>
-    </w:tbl>
-    <w:p>
-      <w:pPr>
-        <w:pStyle w:val="Heading1"/>
-      </w:pPr>
-      <w:r>
-        <w:t>3. Hardware Requirements</w:t>
-      </w:r>
-    </w:p>
-    <w:p>
-      <w:r>
-        <w:t>Minimum requirements for administrative and staff usage.</w:t>
-      </w:r>
-    </w:p>
-    <w:tbl>
-      <w:tblPr>
-        <w:tblStyle w:val="TableGrid"/>
-        <w:tblW w:type="auto" w:w="0"/>
-        <w:tblLook w:firstColumn="1" w:firstRow="1" w:lastColumn="0" w:lastRow="0" w:noHBand="0" w:noVBand="1" w:val="04A0"/>
-      </w:tblPr>
-      <w:tblGrid>
-        <w:gridCol w:w="4320"/>
-        <w:gridCol w:w="4320"/>
-      </w:tblGrid>
-      <w:tr>
-        <w:tc>
-          <w:tcPr>
-            <w:tcW w:type="dxa" w:w="4320"/>
-          </w:tcPr>
-          <w:p>
-            <w:r>
-              <w:t>Requirement</w:t>
-            </w:r>
-          </w:p>
-        </w:tc>
-        <w:tc>
-          <w:tcPr>
-            <w:tcW w:type="dxa" w:w="4320"/>
-          </w:tcPr>
-          <w:p>
-            <w:r>
-              <w:t>Specification</w:t>
+              <w:rPr>
+                <w:rFonts w:ascii="Calibri" w:hAnsi="Calibri"/>
+                <w:color w:val="323232"/>
+                <w:sz w:val="20"/>
+              </w:rPr>
+              <w:t>Version control system.</w:t>
             </w:r>
           </w:p>
         </w:tc>
@@ -517,21 +1701,76 @@
       <w:tr>
         <w:tc>
           <w:tcPr>
-            <w:tcW w:type="dxa" w:w="4320"/>
+            <w:tcW w:type="dxa" w:w="2592"/>
+            <w:shd w:fill="FFFFFF"/>
+            <w:tcMar>
+              <w:top w:w="100" w:type="dxa"/>
+              <w:bottom w:w="100" w:type="dxa"/>
+              <w:left w:w="150" w:type="dxa"/>
+              <w:right w:w="150" w:type="dxa"/>
+            </w:tcMar>
           </w:tcPr>
           <w:p>
+            <w:pPr>
+              <w:jc w:val="left"/>
+            </w:pPr>
             <w:r>
-              <w:t>Computing Device Type</w:t>
+              <w:rPr>
+                <w:rFonts w:ascii="Calibri" w:hAnsi="Calibri"/>
+                <w:color w:val="323232"/>
+                <w:sz w:val="20"/>
+              </w:rPr>
+              <w:t>Postman</w:t>
+            </w:r>
+          </w:p>
+        </w:tc>
+        <w:tc>
+          <w:tcPr>
+            <w:tcW w:type="dxa" w:w="2448"/>
+            <w:shd w:fill="FFFFFF"/>
+            <w:tcMar>
+              <w:top w:w="100" w:type="dxa"/>
+              <w:bottom w:w="100" w:type="dxa"/>
+              <w:left w:w="150" w:type="dxa"/>
+              <w:right w:w="150" w:type="dxa"/>
+            </w:tcMar>
+          </w:tcPr>
+          <w:p>
+            <w:pPr>
+              <w:jc w:val="left"/>
+            </w:pPr>
+            <w:r>
+              <w:rPr>
+                <w:rFonts w:ascii="Calibri" w:hAnsi="Calibri"/>
+                <w:color w:val="323232"/>
+                <w:sz w:val="20"/>
+              </w:rPr>
+              <w:t>Latest</w:t>
             </w:r>
           </w:p>
         </w:tc>
         <w:tc>
           <w:tcPr>
             <w:tcW w:type="dxa" w:w="4320"/>
+            <w:shd w:fill="FFFFFF"/>
+            <w:tcMar>
+              <w:top w:w="100" w:type="dxa"/>
+              <w:bottom w:w="100" w:type="dxa"/>
+              <w:left w:w="150" w:type="dxa"/>
+              <w:right w:w="150" w:type="dxa"/>
+            </w:tcMar>
           </w:tcPr>
           <w:p>
+            <w:pPr>
+              <w:jc w:val="left"/>
+            </w:pPr>
             <w:r>
-              <w:t>PC or Laptop (for clinic staff use)</w:t>
+              <w:rPr>
+                <w:rFonts w:ascii="Calibri" w:hAnsi="Calibri"/>
+                <w:color w:val="323232"/>
+                <w:sz w:val="20"/>
+              </w:rPr>
+              <w:t>API endpoint testing and payload validation.</w:t>
             </w:r>
           </w:p>
         </w:tc>
@@ -539,21 +1778,76 @@
       <w:tr>
         <w:tc>
           <w:tcPr>
-            <w:tcW w:type="dxa" w:w="4320"/>
+            <w:tcW w:type="dxa" w:w="2592"/>
+            <w:shd w:fill="F2F4F7"/>
+            <w:tcMar>
+              <w:top w:w="100" w:type="dxa"/>
+              <w:bottom w:w="100" w:type="dxa"/>
+              <w:left w:w="150" w:type="dxa"/>
+              <w:right w:w="150" w:type="dxa"/>
+            </w:tcMar>
           </w:tcPr>
           <w:p>
+            <w:pPr>
+              <w:jc w:val="left"/>
+            </w:pPr>
             <w:r>
-              <w:t>Processor</w:t>
+              <w:rPr>
+                <w:rFonts w:ascii="Calibri" w:hAnsi="Calibri"/>
+                <w:color w:val="323232"/>
+                <w:sz w:val="20"/>
+              </w:rPr>
+              <w:t>Vite</w:t>
+            </w:r>
+          </w:p>
+        </w:tc>
+        <w:tc>
+          <w:tcPr>
+            <w:tcW w:type="dxa" w:w="2448"/>
+            <w:shd w:fill="F2F4F7"/>
+            <w:tcMar>
+              <w:top w:w="100" w:type="dxa"/>
+              <w:bottom w:w="100" w:type="dxa"/>
+              <w:left w:w="150" w:type="dxa"/>
+              <w:right w:w="150" w:type="dxa"/>
+            </w:tcMar>
+          </w:tcPr>
+          <w:p>
+            <w:pPr>
+              <w:jc w:val="left"/>
+            </w:pPr>
+            <w:r>
+              <w:rPr>
+                <w:rFonts w:ascii="Calibri" w:hAnsi="Calibri"/>
+                <w:color w:val="323232"/>
+                <w:sz w:val="20"/>
+              </w:rPr>
+              <w:t>^8.0.1</w:t>
             </w:r>
           </w:p>
         </w:tc>
         <w:tc>
           <w:tcPr>
             <w:tcW w:type="dxa" w:w="4320"/>
+            <w:shd w:fill="F2F4F7"/>
+            <w:tcMar>
+              <w:top w:w="100" w:type="dxa"/>
+              <w:bottom w:w="100" w:type="dxa"/>
+              <w:left w:w="150" w:type="dxa"/>
+              <w:right w:w="150" w:type="dxa"/>
+            </w:tcMar>
           </w:tcPr>
           <w:p>
+            <w:pPr>
+              <w:jc w:val="left"/>
+            </w:pPr>
             <w:r>
-              <w:t>Intel Core i3 or Ryzen 3 (Dual-core 2.4GHz+)</w:t>
+              <w:rPr>
+                <w:rFonts w:ascii="Calibri" w:hAnsi="Calibri"/>
+                <w:color w:val="323232"/>
+                <w:sz w:val="20"/>
+              </w:rPr>
+              <w:t>Frontend build tool and development server.</w:t>
             </w:r>
           </w:p>
         </w:tc>
@@ -561,119 +1855,191 @@
       <w:tr>
         <w:tc>
           <w:tcPr>
-            <w:tcW w:type="dxa" w:w="4320"/>
+            <w:tcW w:type="dxa" w:w="2592"/>
+            <w:shd w:fill="FFFFFF"/>
+            <w:tcMar>
+              <w:top w:w="100" w:type="dxa"/>
+              <w:bottom w:w="100" w:type="dxa"/>
+              <w:left w:w="150" w:type="dxa"/>
+              <w:right w:w="150" w:type="dxa"/>
+            </w:tcMar>
           </w:tcPr>
           <w:p>
+            <w:pPr>
+              <w:jc w:val="left"/>
+            </w:pPr>
             <w:r>
-              <w:t>Memory (RAM)</w:t>
+              <w:rPr>
+                <w:rFonts w:ascii="Calibri" w:hAnsi="Calibri"/>
+                <w:color w:val="323232"/>
+                <w:sz w:val="20"/>
+              </w:rPr>
+              <w:t>Modern Web Browser</w:t>
+            </w:r>
+          </w:p>
+        </w:tc>
+        <w:tc>
+          <w:tcPr>
+            <w:tcW w:type="dxa" w:w="2448"/>
+            <w:shd w:fill="FFFFFF"/>
+            <w:tcMar>
+              <w:top w:w="100" w:type="dxa"/>
+              <w:bottom w:w="100" w:type="dxa"/>
+              <w:left w:w="150" w:type="dxa"/>
+              <w:right w:w="150" w:type="dxa"/>
+            </w:tcMar>
+          </w:tcPr>
+          <w:p>
+            <w:pPr>
+              <w:jc w:val="left"/>
+            </w:pPr>
+            <w:r>
+              <w:rPr>
+                <w:rFonts w:ascii="Calibri" w:hAnsi="Calibri"/>
+                <w:color w:val="323232"/>
+                <w:sz w:val="20"/>
+              </w:rPr>
+              <w:t>Chrome / Edge / Safari</w:t>
             </w:r>
           </w:p>
         </w:tc>
         <w:tc>
           <w:tcPr>
             <w:tcW w:type="dxa" w:w="4320"/>
+            <w:shd w:fill="FFFFFF"/>
+            <w:tcMar>
+              <w:top w:w="100" w:type="dxa"/>
+              <w:bottom w:w="100" w:type="dxa"/>
+              <w:left w:w="150" w:type="dxa"/>
+              <w:right w:w="150" w:type="dxa"/>
+            </w:tcMar>
           </w:tcPr>
           <w:p>
+            <w:pPr>
+              <w:jc w:val="left"/>
+            </w:pPr>
             <w:r>
-              <w:t>8GB DDR4 (Minimum)</w:t>
-            </w:r>
-          </w:p>
-        </w:tc>
-      </w:tr>
-      <w:tr>
-        <w:tc>
-          <w:tcPr>
-            <w:tcW w:type="dxa" w:w="4320"/>
-          </w:tcPr>
-          <w:p>
-            <w:r>
-              <w:t>Storage</w:t>
-            </w:r>
-          </w:p>
-        </w:tc>
-        <w:tc>
-          <w:tcPr>
-            <w:tcW w:type="dxa" w:w="4320"/>
-          </w:tcPr>
-          <w:p>
-            <w:r>
-              <w:t>256GB SSD (for fast system performance)</w:t>
-            </w:r>
-          </w:p>
-        </w:tc>
-      </w:tr>
-      <w:tr>
-        <w:tc>
-          <w:tcPr>
-            <w:tcW w:type="dxa" w:w="4320"/>
-          </w:tcPr>
-          <w:p>
-            <w:r>
-              <w:t>Network Connectivity</w:t>
-            </w:r>
-          </w:p>
-        </w:tc>
-        <w:tc>
-          <w:tcPr>
-            <w:tcW w:type="dxa" w:w="4320"/>
-          </w:tcPr>
-          <w:p>
-            <w:r>
-              <w:t>Broadband Modem/Router with stable internet connection</w:t>
-            </w:r>
-          </w:p>
-        </w:tc>
-      </w:tr>
-      <w:tr>
-        <w:tc>
-          <w:tcPr>
-            <w:tcW w:type="dxa" w:w="4320"/>
-          </w:tcPr>
-          <w:p>
-            <w:r>
-              <w:t>Scanner/Peripherals</w:t>
-            </w:r>
-          </w:p>
-        </w:tc>
-        <w:tc>
-          <w:tcPr>
-            <w:tcW w:type="dxa" w:w="4320"/>
-          </w:tcPr>
-          <w:p>
-            <w:r>
-              <w:t>High-resolution scanner or camera (for OCR uploads)</w:t>
-            </w:r>
-          </w:p>
-        </w:tc>
-      </w:tr>
-      <w:tr>
-        <w:tc>
-          <w:tcPr>
-            <w:tcW w:type="dxa" w:w="4320"/>
-          </w:tcPr>
-          <w:p>
-            <w:r>
-              <w:t>Display</w:t>
-            </w:r>
-          </w:p>
-        </w:tc>
-        <w:tc>
-          <w:tcPr>
-            <w:tcW w:type="dxa" w:w="4320"/>
-          </w:tcPr>
-          <w:p>
-            <w:r>
-              <w:t>Standard 1080p monitor for dashboard visibility</w:t>
+              <w:rPr>
+                <w:rFonts w:ascii="Calibri" w:hAnsi="Calibri"/>
+                <w:color w:val="323232"/>
+                <w:sz w:val="20"/>
+              </w:rPr>
+              <w:t>Client interface testing and application interaction.</w:t>
             </w:r>
           </w:p>
         </w:tc>
       </w:tr>
     </w:tbl>
+    <w:p/>
     <w:p>
       <w:pPr>
         <w:pStyle w:val="Heading1"/>
       </w:pPr>
       <w:r>
+        <w:rPr>
+          <w:color w:val="1F4E78"/>
+        </w:rPr>
+        <w:t>3. Hardware Requirements</w:t>
+      </w:r>
+    </w:p>
+    <w:p>
+      <w:r>
+        <w:t>Minimum hardware requirements for administrative, clinic, and staff usage.</w:t>
+      </w:r>
+    </w:p>
+    <w:p>
+      <w:pPr>
+        <w:pStyle w:val="ListBullet"/>
+      </w:pPr>
+      <w:r>
+        <w:rPr>
+          <w:b/>
+        </w:rPr>
+        <w:t xml:space="preserve">Type: </w:t>
+      </w:r>
+      <w:r>
+        <w:t>PC or Laptop (for administrative and clinic staff use)</w:t>
+      </w:r>
+    </w:p>
+    <w:p>
+      <w:pPr>
+        <w:pStyle w:val="ListBullet"/>
+      </w:pPr>
+      <w:r>
+        <w:rPr>
+          <w:b/>
+        </w:rPr>
+        <w:t xml:space="preserve">Processor: </w:t>
+      </w:r>
+      <w:r>
+        <w:t>Intel Core i3 or AMD Ryzen 3 (Dual-core 2.4GHz+)</w:t>
+      </w:r>
+    </w:p>
+    <w:p>
+      <w:pPr>
+        <w:pStyle w:val="ListBullet"/>
+      </w:pPr>
+      <w:r>
+        <w:rPr>
+          <w:b/>
+        </w:rPr>
+        <w:t xml:space="preserve">Memory (RAM): </w:t>
+      </w:r>
+      <w:r>
+        <w:t>8GB DDR4 (Minimum) / 16GB (Recommended for dev)</w:t>
+      </w:r>
+    </w:p>
+    <w:p>
+      <w:pPr>
+        <w:pStyle w:val="ListBullet"/>
+      </w:pPr>
+      <w:r>
+        <w:rPr>
+          <w:b/>
+        </w:rPr>
+        <w:t xml:space="preserve">Storage: </w:t>
+      </w:r>
+      <w:r>
+        <w:t>256GB SSD (for fast system performance)</w:t>
+      </w:r>
+    </w:p>
+    <w:p>
+      <w:pPr>
+        <w:pStyle w:val="ListBullet"/>
+      </w:pPr>
+      <w:r>
+        <w:rPr>
+          <w:b/>
+        </w:rPr>
+        <w:t xml:space="preserve">Network: </w:t>
+      </w:r>
+      <w:r>
+        <w:t>Broadband Modem/Router with stable internet connection (Required for Gemini API)</w:t>
+      </w:r>
+    </w:p>
+    <w:p>
+      <w:pPr>
+        <w:pStyle w:val="ListBullet"/>
+      </w:pPr>
+      <w:r>
+        <w:rPr>
+          <w:b/>
+        </w:rPr>
+        <w:t xml:space="preserve">Peripherals: </w:t>
+      </w:r>
+      <w:r>
+        <w:t>High-resolution scanner/camera (for document uploads), standard 1080p monitor.</w:t>
+      </w:r>
+    </w:p>
+    <w:p/>
+    <w:p>
+      <w:pPr>
+        <w:pStyle w:val="Heading1"/>
+      </w:pPr>
+      <w:r>
+        <w:rPr>
+          <w:color w:val="1F4E78"/>
+        </w:rPr>
         <w:t>4. SDLC Model: Agile Model</w:t>
       </w:r>
     </w:p>
@@ -687,47 +2053,99 @@
         <w:pStyle w:val="Heading2"/>
       </w:pPr>
       <w:r>
+        <w:rPr>
+          <w:color w:val="2E75B6"/>
+        </w:rPr>
         <w:t>Proposed Timetable (6 Months)</w:t>
       </w:r>
     </w:p>
     <w:tbl>
       <w:tblPr>
-        <w:tblStyle w:val="TableGrid"/>
         <w:tblW w:type="auto" w:w="0"/>
+        <w:jc w:val="center"/>
+        <w:tblLayout w:type="fixed"/>
         <w:tblLook w:firstColumn="1" w:firstRow="1" w:lastColumn="0" w:lastRow="0" w:noHBand="0" w:noVBand="1" w:val="04A0"/>
       </w:tblPr>
       <w:tblGrid>
-        <w:gridCol w:w="2880"/>
-        <w:gridCol w:w="2880"/>
-        <w:gridCol w:w="2880"/>
+        <w:gridCol w:w="3120"/>
+        <w:gridCol w:w="3120"/>
+        <w:gridCol w:w="3120"/>
       </w:tblGrid>
       <w:tr>
         <w:tc>
           <w:tcPr>
-            <w:tcW w:type="dxa" w:w="2880"/>
+            <w:tcW w:type="dxa" w:w="1728"/>
+            <w:shd w:fill="1F4E78"/>
+            <w:tcMar>
+              <w:top w:w="120" w:type="dxa"/>
+              <w:bottom w:w="120" w:type="dxa"/>
+              <w:left w:w="150" w:type="dxa"/>
+              <w:right w:w="150" w:type="dxa"/>
+            </w:tcMar>
           </w:tcPr>
           <w:p>
+            <w:pPr>
+              <w:jc w:val="left"/>
+            </w:pPr>
             <w:r>
-              <w:t>Timeframe</w:t>
+              <w:rPr>
+                <w:rFonts w:ascii="Calibri" w:hAnsi="Calibri"/>
+                <w:b/>
+                <w:color w:val="FFFFFF"/>
+                <w:sz w:val="21"/>
+              </w:rPr>
+              <w:t>Month</w:t>
             </w:r>
           </w:p>
         </w:tc>
         <w:tc>
           <w:tcPr>
-            <w:tcW w:type="dxa" w:w="2880"/>
+            <w:tcW w:type="dxa" w:w="3312"/>
+            <w:shd w:fill="1F4E78"/>
+            <w:tcMar>
+              <w:top w:w="120" w:type="dxa"/>
+              <w:bottom w:w="120" w:type="dxa"/>
+              <w:left w:w="150" w:type="dxa"/>
+              <w:right w:w="150" w:type="dxa"/>
+            </w:tcMar>
           </w:tcPr>
           <w:p>
+            <w:pPr>
+              <w:jc w:val="left"/>
+            </w:pPr>
             <w:r>
+              <w:rPr>
+                <w:rFonts w:ascii="Calibri" w:hAnsi="Calibri"/>
+                <w:b/>
+                <w:color w:val="FFFFFF"/>
+                <w:sz w:val="21"/>
+              </w:rPr>
               <w:t>Phase</w:t>
             </w:r>
           </w:p>
         </w:tc>
         <w:tc>
           <w:tcPr>
-            <w:tcW w:type="dxa" w:w="2880"/>
+            <w:tcW w:type="dxa" w:w="4320"/>
+            <w:shd w:fill="1F4E78"/>
+            <w:tcMar>
+              <w:top w:w="120" w:type="dxa"/>
+              <w:bottom w:w="120" w:type="dxa"/>
+              <w:left w:w="150" w:type="dxa"/>
+              <w:right w:w="150" w:type="dxa"/>
+            </w:tcMar>
           </w:tcPr>
           <w:p>
+            <w:pPr>
+              <w:jc w:val="left"/>
+            </w:pPr>
             <w:r>
+              <w:rPr>
+                <w:rFonts w:ascii="Calibri" w:hAnsi="Calibri"/>
+                <w:b/>
+                <w:color w:val="FFFFFF"/>
+                <w:sz w:val="21"/>
+              </w:rPr>
               <w:t>Key Activities</w:t>
             </w:r>
           </w:p>
@@ -736,30 +2154,75 @@
       <w:tr>
         <w:tc>
           <w:tcPr>
-            <w:tcW w:type="dxa" w:w="2880"/>
+            <w:tcW w:type="dxa" w:w="1728"/>
+            <w:shd w:fill="FFFFFF"/>
+            <w:tcMar>
+              <w:top w:w="100" w:type="dxa"/>
+              <w:bottom w:w="100" w:type="dxa"/>
+              <w:left w:w="150" w:type="dxa"/>
+              <w:right w:w="150" w:type="dxa"/>
+            </w:tcMar>
           </w:tcPr>
           <w:p>
+            <w:pPr>
+              <w:jc w:val="left"/>
+            </w:pPr>
             <w:r>
+              <w:rPr>
+                <w:rFonts w:ascii="Calibri" w:hAnsi="Calibri"/>
+                <w:color w:val="323232"/>
+                <w:sz w:val="20"/>
+              </w:rPr>
               <w:t>Month 1</w:t>
             </w:r>
           </w:p>
         </w:tc>
         <w:tc>
           <w:tcPr>
-            <w:tcW w:type="dxa" w:w="2880"/>
+            <w:tcW w:type="dxa" w:w="3312"/>
+            <w:shd w:fill="FFFFFF"/>
+            <w:tcMar>
+              <w:top w:w="100" w:type="dxa"/>
+              <w:bottom w:w="100" w:type="dxa"/>
+              <w:left w:w="150" w:type="dxa"/>
+              <w:right w:w="150" w:type="dxa"/>
+            </w:tcMar>
           </w:tcPr>
           <w:p>
+            <w:pPr>
+              <w:jc w:val="left"/>
+            </w:pPr>
             <w:r>
-              <w:t>Planning &amp; Requirements Gathering</w:t>
+              <w:rPr>
+                <w:rFonts w:ascii="Calibri" w:hAnsi="Calibri"/>
+                <w:color w:val="323232"/>
+                <w:sz w:val="20"/>
+              </w:rPr>
+              <w:t>Planning &amp; Requirements</w:t>
             </w:r>
           </w:p>
         </w:tc>
         <w:tc>
           <w:tcPr>
-            <w:tcW w:type="dxa" w:w="2880"/>
+            <w:tcW w:type="dxa" w:w="4320"/>
+            <w:shd w:fill="FFFFFF"/>
+            <w:tcMar>
+              <w:top w:w="100" w:type="dxa"/>
+              <w:bottom w:w="100" w:type="dxa"/>
+              <w:left w:w="150" w:type="dxa"/>
+              <w:right w:w="150" w:type="dxa"/>
+            </w:tcMar>
           </w:tcPr>
           <w:p>
+            <w:pPr>
+              <w:jc w:val="left"/>
+            </w:pPr>
             <w:r>
+              <w:rPr>
+                <w:rFonts w:ascii="Calibri" w:hAnsi="Calibri"/>
+                <w:color w:val="323232"/>
+                <w:sz w:val="20"/>
+              </w:rPr>
               <w:t>Identifying system problems, objectives, and user needs.</w:t>
             </w:r>
           </w:p>
@@ -768,30 +2231,75 @@
       <w:tr>
         <w:tc>
           <w:tcPr>
-            <w:tcW w:type="dxa" w:w="2880"/>
+            <w:tcW w:type="dxa" w:w="1728"/>
+            <w:shd w:fill="F2F4F7"/>
+            <w:tcMar>
+              <w:top w:w="100" w:type="dxa"/>
+              <w:bottom w:w="100" w:type="dxa"/>
+              <w:left w:w="150" w:type="dxa"/>
+              <w:right w:w="150" w:type="dxa"/>
+            </w:tcMar>
           </w:tcPr>
           <w:p>
+            <w:pPr>
+              <w:jc w:val="left"/>
+            </w:pPr>
             <w:r>
+              <w:rPr>
+                <w:rFonts w:ascii="Calibri" w:hAnsi="Calibri"/>
+                <w:color w:val="323232"/>
+                <w:sz w:val="20"/>
+              </w:rPr>
               <w:t>Month 2</w:t>
             </w:r>
           </w:p>
         </w:tc>
         <w:tc>
           <w:tcPr>
-            <w:tcW w:type="dxa" w:w="2880"/>
+            <w:tcW w:type="dxa" w:w="3312"/>
+            <w:shd w:fill="F2F4F7"/>
+            <w:tcMar>
+              <w:top w:w="100" w:type="dxa"/>
+              <w:bottom w:w="100" w:type="dxa"/>
+              <w:left w:w="150" w:type="dxa"/>
+              <w:right w:w="150" w:type="dxa"/>
+            </w:tcMar>
           </w:tcPr>
           <w:p>
+            <w:pPr>
+              <w:jc w:val="left"/>
+            </w:pPr>
             <w:r>
+              <w:rPr>
+                <w:rFonts w:ascii="Calibri" w:hAnsi="Calibri"/>
+                <w:color w:val="323232"/>
+                <w:sz w:val="20"/>
+              </w:rPr>
               <w:t>System Design</w:t>
             </w:r>
           </w:p>
         </w:tc>
         <w:tc>
           <w:tcPr>
-            <w:tcW w:type="dxa" w:w="2880"/>
+            <w:tcW w:type="dxa" w:w="4320"/>
+            <w:shd w:fill="F2F4F7"/>
+            <w:tcMar>
+              <w:top w:w="100" w:type="dxa"/>
+              <w:bottom w:w="100" w:type="dxa"/>
+              <w:left w:w="150" w:type="dxa"/>
+              <w:right w:w="150" w:type="dxa"/>
+            </w:tcMar>
           </w:tcPr>
           <w:p>
+            <w:pPr>
+              <w:jc w:val="left"/>
+            </w:pPr>
             <w:r>
+              <w:rPr>
+                <w:rFonts w:ascii="Calibri" w:hAnsi="Calibri"/>
+                <w:color w:val="323232"/>
+                <w:sz w:val="20"/>
+              </w:rPr>
               <w:t>Architecture design, UI/UX prototyping, and AI logic planning.</w:t>
             </w:r>
           </w:p>
@@ -800,30 +2308,75 @@
       <w:tr>
         <w:tc>
           <w:tcPr>
-            <w:tcW w:type="dxa" w:w="2880"/>
+            <w:tcW w:type="dxa" w:w="1728"/>
+            <w:shd w:fill="FFFFFF"/>
+            <w:tcMar>
+              <w:top w:w="100" w:type="dxa"/>
+              <w:bottom w:w="100" w:type="dxa"/>
+              <w:left w:w="150" w:type="dxa"/>
+              <w:right w:w="150" w:type="dxa"/>
+            </w:tcMar>
           </w:tcPr>
           <w:p>
+            <w:pPr>
+              <w:jc w:val="left"/>
+            </w:pPr>
             <w:r>
+              <w:rPr>
+                <w:rFonts w:ascii="Calibri" w:hAnsi="Calibri"/>
+                <w:color w:val="323232"/>
+                <w:sz w:val="20"/>
+              </w:rPr>
               <w:t>Month 3</w:t>
             </w:r>
           </w:p>
         </w:tc>
         <w:tc>
           <w:tcPr>
-            <w:tcW w:type="dxa" w:w="2880"/>
+            <w:tcW w:type="dxa" w:w="3312"/>
+            <w:shd w:fill="FFFFFF"/>
+            <w:tcMar>
+              <w:top w:w="100" w:type="dxa"/>
+              <w:bottom w:w="100" w:type="dxa"/>
+              <w:left w:w="150" w:type="dxa"/>
+              <w:right w:w="150" w:type="dxa"/>
+            </w:tcMar>
           </w:tcPr>
           <w:p>
+            <w:pPr>
+              <w:jc w:val="left"/>
+            </w:pPr>
             <w:r>
+              <w:rPr>
+                <w:rFonts w:ascii="Calibri" w:hAnsi="Calibri"/>
+                <w:color w:val="323232"/>
+                <w:sz w:val="20"/>
+              </w:rPr>
               <w:t>Core Development</w:t>
             </w:r>
           </w:p>
         </w:tc>
         <w:tc>
           <w:tcPr>
-            <w:tcW w:type="dxa" w:w="2880"/>
+            <w:tcW w:type="dxa" w:w="4320"/>
+            <w:shd w:fill="FFFFFF"/>
+            <w:tcMar>
+              <w:top w:w="100" w:type="dxa"/>
+              <w:bottom w:w="100" w:type="dxa"/>
+              <w:left w:w="150" w:type="dxa"/>
+              <w:right w:w="150" w:type="dxa"/>
+            </w:tcMar>
           </w:tcPr>
           <w:p>
+            <w:pPr>
+              <w:jc w:val="left"/>
+            </w:pPr>
             <w:r>
+              <w:rPr>
+                <w:rFonts w:ascii="Calibri" w:hAnsi="Calibri"/>
+                <w:color w:val="323232"/>
+                <w:sz w:val="20"/>
+              </w:rPr>
               <w:t>Building Student Info Module and Database structure.</w:t>
             </w:r>
           </w:p>
@@ -832,31 +2385,76 @@
       <w:tr>
         <w:tc>
           <w:tcPr>
-            <w:tcW w:type="dxa" w:w="2880"/>
+            <w:tcW w:type="dxa" w:w="1728"/>
+            <w:shd w:fill="F2F4F7"/>
+            <w:tcMar>
+              <w:top w:w="100" w:type="dxa"/>
+              <w:bottom w:w="100" w:type="dxa"/>
+              <w:left w:w="150" w:type="dxa"/>
+              <w:right w:w="150" w:type="dxa"/>
+            </w:tcMar>
           </w:tcPr>
           <w:p>
+            <w:pPr>
+              <w:jc w:val="left"/>
+            </w:pPr>
             <w:r>
+              <w:rPr>
+                <w:rFonts w:ascii="Calibri" w:hAnsi="Calibri"/>
+                <w:color w:val="323232"/>
+                <w:sz w:val="20"/>
+              </w:rPr>
               <w:t>Month 4</w:t>
             </w:r>
           </w:p>
         </w:tc>
         <w:tc>
           <w:tcPr>
-            <w:tcW w:type="dxa" w:w="2880"/>
+            <w:tcW w:type="dxa" w:w="3312"/>
+            <w:shd w:fill="F2F4F7"/>
+            <w:tcMar>
+              <w:top w:w="100" w:type="dxa"/>
+              <w:bottom w:w="100" w:type="dxa"/>
+              <w:left w:w="150" w:type="dxa"/>
+              <w:right w:w="150" w:type="dxa"/>
+            </w:tcMar>
           </w:tcPr>
           <w:p>
+            <w:pPr>
+              <w:jc w:val="left"/>
+            </w:pPr>
             <w:r>
+              <w:rPr>
+                <w:rFonts w:ascii="Calibri" w:hAnsi="Calibri"/>
+                <w:color w:val="323232"/>
+                <w:sz w:val="20"/>
+              </w:rPr>
               <w:t>AI Integration</w:t>
             </w:r>
           </w:p>
         </w:tc>
         <w:tc>
           <w:tcPr>
-            <w:tcW w:type="dxa" w:w="2880"/>
+            <w:tcW w:type="dxa" w:w="4320"/>
+            <w:shd w:fill="F2F4F7"/>
+            <w:tcMar>
+              <w:top w:w="100" w:type="dxa"/>
+              <w:bottom w:w="100" w:type="dxa"/>
+              <w:left w:w="150" w:type="dxa"/>
+              <w:right w:w="150" w:type="dxa"/>
+            </w:tcMar>
           </w:tcPr>
           <w:p>
+            <w:pPr>
+              <w:jc w:val="left"/>
+            </w:pPr>
             <w:r>
-              <w:t>OCR automation development and ML tracking implementation.</w:t>
+              <w:rPr>
+                <w:rFonts w:ascii="Calibri" w:hAnsi="Calibri"/>
+                <w:color w:val="323232"/>
+                <w:sz w:val="20"/>
+              </w:rPr>
+              <w:t>AI implementation and ML tracking.</w:t>
             </w:r>
           </w:p>
         </w:tc>
@@ -864,31 +2462,76 @@
       <w:tr>
         <w:tc>
           <w:tcPr>
-            <w:tcW w:type="dxa" w:w="2880"/>
+            <w:tcW w:type="dxa" w:w="1728"/>
+            <w:shd w:fill="FFFFFF"/>
+            <w:tcMar>
+              <w:top w:w="100" w:type="dxa"/>
+              <w:bottom w:w="100" w:type="dxa"/>
+              <w:left w:w="150" w:type="dxa"/>
+              <w:right w:w="150" w:type="dxa"/>
+            </w:tcMar>
           </w:tcPr>
           <w:p>
+            <w:pPr>
+              <w:jc w:val="left"/>
+            </w:pPr>
             <w:r>
+              <w:rPr>
+                <w:rFonts w:ascii="Calibri" w:hAnsi="Calibri"/>
+                <w:color w:val="323232"/>
+                <w:sz w:val="20"/>
+              </w:rPr>
               <w:t>Month 5</w:t>
             </w:r>
           </w:p>
         </w:tc>
         <w:tc>
           <w:tcPr>
-            <w:tcW w:type="dxa" w:w="2880"/>
+            <w:tcW w:type="dxa" w:w="3312"/>
+            <w:shd w:fill="FFFFFF"/>
+            <w:tcMar>
+              <w:top w:w="100" w:type="dxa"/>
+              <w:bottom w:w="100" w:type="dxa"/>
+              <w:left w:w="150" w:type="dxa"/>
+              <w:right w:w="150" w:type="dxa"/>
+            </w:tcMar>
           </w:tcPr>
           <w:p>
+            <w:pPr>
+              <w:jc w:val="left"/>
+            </w:pPr>
             <w:r>
+              <w:rPr>
+                <w:rFonts w:ascii="Calibri" w:hAnsi="Calibri"/>
+                <w:color w:val="323232"/>
+                <w:sz w:val="20"/>
+              </w:rPr>
               <w:t>Testing &amp; Validation</w:t>
             </w:r>
           </w:p>
         </w:tc>
         <w:tc>
           <w:tcPr>
-            <w:tcW w:type="dxa" w:w="2880"/>
+            <w:tcW w:type="dxa" w:w="4320"/>
+            <w:shd w:fill="FFFFFF"/>
+            <w:tcMar>
+              <w:top w:w="100" w:type="dxa"/>
+              <w:bottom w:w="100" w:type="dxa"/>
+              <w:left w:w="150" w:type="dxa"/>
+              <w:right w:w="150" w:type="dxa"/>
+            </w:tcMar>
           </w:tcPr>
           <w:p>
+            <w:pPr>
+              <w:jc w:val="left"/>
+            </w:pPr>
             <w:r>
-              <w:t>System testing, OCR accuracy validation, and bug fixing.</w:t>
+              <w:rPr>
+                <w:rFonts w:ascii="Calibri" w:hAnsi="Calibri"/>
+                <w:color w:val="323232"/>
+                <w:sz w:val="20"/>
+              </w:rPr>
+              <w:t>System testing and bug fixing.</w:t>
             </w:r>
           </w:p>
         </w:tc>
@@ -896,41 +2539,90 @@
       <w:tr>
         <w:tc>
           <w:tcPr>
-            <w:tcW w:type="dxa" w:w="2880"/>
+            <w:tcW w:type="dxa" w:w="1728"/>
+            <w:shd w:fill="F2F4F7"/>
+            <w:tcMar>
+              <w:top w:w="100" w:type="dxa"/>
+              <w:bottom w:w="100" w:type="dxa"/>
+              <w:left w:w="150" w:type="dxa"/>
+              <w:right w:w="150" w:type="dxa"/>
+            </w:tcMar>
           </w:tcPr>
           <w:p>
+            <w:pPr>
+              <w:jc w:val="left"/>
+            </w:pPr>
             <w:r>
+              <w:rPr>
+                <w:rFonts w:ascii="Calibri" w:hAnsi="Calibri"/>
+                <w:color w:val="323232"/>
+                <w:sz w:val="20"/>
+              </w:rPr>
               <w:t>Month 6</w:t>
             </w:r>
           </w:p>
         </w:tc>
         <w:tc>
           <w:tcPr>
-            <w:tcW w:type="dxa" w:w="2880"/>
+            <w:tcW w:type="dxa" w:w="3312"/>
+            <w:shd w:fill="F2F4F7"/>
+            <w:tcMar>
+              <w:top w:w="100" w:type="dxa"/>
+              <w:bottom w:w="100" w:type="dxa"/>
+              <w:left w:w="150" w:type="dxa"/>
+              <w:right w:w="150" w:type="dxa"/>
+            </w:tcMar>
           </w:tcPr>
           <w:p>
+            <w:pPr>
+              <w:jc w:val="left"/>
+            </w:pPr>
             <w:r>
+              <w:rPr>
+                <w:rFonts w:ascii="Calibri" w:hAnsi="Calibri"/>
+                <w:color w:val="323232"/>
+                <w:sz w:val="20"/>
+              </w:rPr>
               <w:t>Deployment &amp; Improvement</w:t>
             </w:r>
           </w:p>
         </w:tc>
         <w:tc>
           <w:tcPr>
-            <w:tcW w:type="dxa" w:w="2880"/>
+            <w:tcW w:type="dxa" w:w="4320"/>
+            <w:shd w:fill="F2F4F7"/>
+            <w:tcMar>
+              <w:top w:w="100" w:type="dxa"/>
+              <w:bottom w:w="100" w:type="dxa"/>
+              <w:left w:w="150" w:type="dxa"/>
+              <w:right w:w="150" w:type="dxa"/>
+            </w:tcMar>
           </w:tcPr>
           <w:p>
+            <w:pPr>
+              <w:jc w:val="left"/>
+            </w:pPr>
             <w:r>
+              <w:rPr>
+                <w:rFonts w:ascii="Calibri" w:hAnsi="Calibri"/>
+                <w:color w:val="323232"/>
+                <w:sz w:val="20"/>
+              </w:rPr>
               <w:t>Final deployment, staff training, and feature refinement.</w:t>
             </w:r>
           </w:p>
         </w:tc>
       </w:tr>
     </w:tbl>
+    <w:p/>
     <w:p>
       <w:pPr>
         <w:pStyle w:val="Heading1"/>
       </w:pPr>
       <w:r>
+        <w:rPr>
+          <w:color w:val="1F4E78"/>
+        </w:rPr>
         <w:t>5. Features of the Proposed System</w:t>
       </w:r>
     </w:p>
@@ -942,10 +2634,10 @@
         <w:rPr>
           <w:b/>
         </w:rPr>
-        <w:t xml:space="preserve">Automated Enrollment (OCR): </w:t>
+        <w:t xml:space="preserve">Digital Enrollment Forms: </w:t>
       </w:r>
       <w:r>
-        <w:t>Extracts student data from uploaded forms directly into the database, reducing repetitive encoding.</w:t>
+        <w:t>Streamlined student enrollment with document uploads.</w:t>
       </w:r>
     </w:p>
     <w:p>
@@ -1001,7 +2693,7 @@
         <w:t xml:space="preserve">Intelligent Report Generator: </w:t>
       </w:r>
       <w:r>
-        <w:t>Generates institutional and student reports in seconds instead of hours.</w:t>
+        <w:t>Generates institutional and student reports in seconds using Gemini 2.0 Flash.</w:t>
       </w:r>
     </w:p>
     <w:p>
@@ -1020,7 +2712,7 @@
     </w:p>
     <w:sectPr>
       <w:pgSz w:w="12240" w:h="15840"/>
-      <w:pgMar w:top="1440" w:right="1800" w:bottom="1440" w:left="1800" w:header="720" w:footer="720" w:gutter="0"/>
+      <w:pgMar w:top="1440" w:right="1440" w:bottom="1440" w:left="1440" w:header="720" w:footer="720" w:gutter="0"/>
       <w:cols w:space="720"/>
       <w:docGrid w:linePitch="360"/>
     </w:sectPr>

</xml_diff>